<commit_message>
docs(templates): update AI Audit Report and Reflective Statement
</commit_message>
<xml_diff>
--- a/AI Templates/[AI-02] - FIT@HCMUS - AI Audit Report_En.docx
+++ b/AI Templates/[AI-02] - FIT@HCMUS - AI Audit Report_En.docx
@@ -202,7 +202,19 @@
           <w:p>
             <w:pPr>
               <w:cnfStyle w:val="000000100000" w:firstRow="0" w:lastRow="0" w:firstColumn="0" w:lastColumn="0" w:oddVBand="0" w:evenVBand="0" w:oddHBand="1" w:evenHBand="0" w:firstRowFirstColumn="0" w:firstRowLastColumn="0" w:lastRowFirstColumn="0" w:lastRowLastColumn="0"/>
+              <w:rPr>
+                <w:lang w:val="vi-VN"/>
+              </w:rPr>
             </w:pPr>
+            <w:r>
+              <w:t>Tran</w:t>
+            </w:r>
+            <w:r>
+              <w:rPr>
+                <w:lang w:val="vi-VN"/>
+              </w:rPr>
+              <w:t xml:space="preserve"> Dai Hiep</w:t>
+            </w:r>
           </w:p>
         </w:tc>
       </w:tr>
@@ -233,6 +245,9 @@
             <w:pPr>
               <w:cnfStyle w:val="000000010000" w:firstRow="0" w:lastRow="0" w:firstColumn="0" w:lastColumn="0" w:oddVBand="0" w:evenVBand="0" w:oddHBand="0" w:evenHBand="1" w:firstRowFirstColumn="0" w:firstRowLastColumn="0" w:lastRowFirstColumn="0" w:lastRowLastColumn="0"/>
             </w:pPr>
+            <w:r>
+              <w:t>23120256</w:t>
+            </w:r>
           </w:p>
         </w:tc>
       </w:tr>
@@ -292,7 +307,19 @@
           <w:p>
             <w:pPr>
               <w:cnfStyle w:val="000000010000" w:firstRow="0" w:lastRow="0" w:firstColumn="0" w:lastColumn="0" w:oddVBand="0" w:evenVBand="0" w:oddHBand="0" w:evenHBand="1" w:firstRowFirstColumn="0" w:firstRowLastColumn="0" w:lastRowFirstColumn="0" w:lastRowLastColumn="0"/>
+              <w:rPr>
+                <w:lang w:val="vi-VN"/>
+              </w:rPr>
             </w:pPr>
+            <w:r>
+              <w:t>HW</w:t>
+            </w:r>
+            <w:r>
+              <w:rPr>
+                <w:lang w:val="vi-VN"/>
+              </w:rPr>
+              <w:t>#01</w:t>
+            </w:r>
           </w:p>
         </w:tc>
       </w:tr>
@@ -352,7 +379,19 @@
           <w:p>
             <w:pPr>
               <w:cnfStyle w:val="000000010000" w:firstRow="0" w:lastRow="0" w:firstColumn="0" w:lastColumn="0" w:oddVBand="0" w:evenVBand="0" w:oddHBand="0" w:evenHBand="1" w:firstRowFirstColumn="0" w:firstRowLastColumn="0" w:lastRowFirstColumn="0" w:lastRowLastColumn="0"/>
+              <w:rPr>
+                <w:lang w:val="vi-VN"/>
+              </w:rPr>
             </w:pPr>
+            <w:r>
+              <w:t>Gemini</w:t>
+            </w:r>
+            <w:r>
+              <w:rPr>
+                <w:lang w:val="vi-VN"/>
+              </w:rPr>
+              <w:t>, ChatGPT, Github Copilot, Antigravity IDE</w:t>
+            </w:r>
           </w:p>
         </w:tc>
       </w:tr>
@@ -388,7 +427,21 @@
                 <w:rFonts w:ascii="Arial" w:hAnsi="Arial"/>
                 <w:sz w:val="21"/>
               </w:rPr>
-              <w:t>[ ] Yes  [ ] No</w:t>
+              <w:t>[</w:t>
+            </w:r>
+            <w:r>
+              <w:rPr>
+                <w:rFonts w:ascii="Arial" w:hAnsi="Arial"/>
+                <w:sz w:val="21"/>
+              </w:rPr>
+              <w:t>X</w:t>
+            </w:r>
+            <w:r>
+              <w:rPr>
+                <w:rFonts w:ascii="Arial" w:hAnsi="Arial"/>
+                <w:sz w:val="21"/>
+              </w:rPr>
+              <w:t>] Yes  [ ] No</w:t>
             </w:r>
           </w:p>
         </w:tc>
@@ -496,7 +549,7 @@
     <w:tbl>
       <w:tblPr>
         <w:tblStyle w:val="LightGrid-Accent1"/>
-        <w:tblW w:w="0" w:type="auto"/>
+        <w:tblW w:w="9637" w:type="dxa"/>
         <w:tblLayout w:type="fixed"/>
         <w:tblLook w:val="04A0" w:firstRow="1" w:lastRow="0" w:firstColumn="1" w:lastColumn="0" w:noHBand="0" w:noVBand="1"/>
       </w:tblPr>
@@ -620,7 +673,180 @@
                 <w:rFonts w:ascii="Arial" w:hAnsi="Arial"/>
                 <w:sz w:val="21"/>
               </w:rPr>
-              <w:t>Sample (italic) — replace before submission:</w:t>
+              <w:t>Tool: </w:t>
+            </w:r>
+            <w:r>
+              <w:rPr>
+                <w:rFonts w:ascii="Arial" w:hAnsi="Arial"/>
+                <w:sz w:val="21"/>
+              </w:rPr>
+              <w:t>Antigravity</w:t>
+            </w:r>
+            <w:r>
+              <w:rPr>
+                <w:rFonts w:ascii="Arial" w:hAnsi="Arial"/>
+                <w:sz w:val="21"/>
+                <w:lang w:val="vi-VN"/>
+              </w:rPr>
+              <w:t xml:space="preserve"> IDE</w:t>
+            </w:r>
+            <w:r>
+              <w:rPr>
+                <w:rFonts w:ascii="Arial" w:hAnsi="Arial"/>
+                <w:sz w:val="21"/>
+              </w:rPr>
+              <w:br/>
+              <w:t>Time: 2026-09-27T06:43:57+07:00</w:t>
+            </w:r>
+            <w:r>
+              <w:rPr>
+                <w:rFonts w:ascii="Arial" w:hAnsi="Arial"/>
+                <w:sz w:val="21"/>
+              </w:rPr>
+              <w:br/>
+              <w:t>Prompt:</w:t>
+            </w:r>
+            <w:r>
+              <w:rPr>
+                <w:rFonts w:ascii="Arial" w:hAnsi="Arial"/>
+                <w:sz w:val="21"/>
+              </w:rPr>
+              <w:br/>
+              <w:t xml:space="preserve">Bạn là một Software Tester / QA Engineer. Hãy thực hiện phân tích và thiết kế test </w:t>
+            </w:r>
+            <w:r>
+              <w:rPr>
+                <w:rFonts w:ascii="Arial" w:hAnsi="Arial"/>
+                <w:sz w:val="21"/>
+              </w:rPr>
+              <w:lastRenderedPageBreak/>
+              <w:t>case cho sản phẩm quạt công nghiệp Kim Cương dựa trên thông tin được cung cấp tại:</w:t>
+            </w:r>
+            <w:r>
+              <w:rPr>
+                <w:rFonts w:ascii="Arial" w:hAnsi="Arial"/>
+                <w:sz w:val="21"/>
+              </w:rPr>
+              <w:br/>
+              <w:t>Product URL:</w:t>
+            </w:r>
+            <w:r>
+              <w:rPr>
+                <w:rFonts w:ascii="Arial" w:hAnsi="Arial"/>
+                <w:sz w:val="21"/>
+              </w:rPr>
+              <w:br/>
+            </w:r>
+            <w:hyperlink r:id="rId6" w:history="1">
+              <w:r>
+                <w:rPr>
+                  <w:rStyle w:val="Hyperlink"/>
+                  <w:rFonts w:ascii="Arial" w:hAnsi="Arial"/>
+                  <w:b w:val="0"/>
+                  <w:bCs w:val="0"/>
+                  <w:sz w:val="21"/>
+                </w:rPr>
+                <w:t>https://giadungkimcuong.vn/quat-cong-nghiep-kim-cuong/</w:t>
+              </w:r>
+            </w:hyperlink>
+            <w:r>
+              <w:rPr>
+                <w:rFonts w:ascii="Arial" w:hAnsi="Arial"/>
+                <w:sz w:val="21"/>
+              </w:rPr>
+              <w:br/>
+              <w:t>1. Thu thập và phân tích thông tin</w:t>
+            </w:r>
+            <w:r>
+              <w:rPr>
+                <w:rFonts w:ascii="Arial" w:hAnsi="Arial"/>
+                <w:sz w:val="21"/>
+              </w:rPr>
+              <w:br/>
+              <w:t>Truy cập trang web trên và đọc kỹ nội dung để xác định: Các loại/model quạt được giới thiệu. Chức năng và cách sử dụng. Các nút/công tắc điều khiển nếu có. Các mức tốc độ nếu có. Chế độ hoạt động nếu có. Thông số kỹ thuật liên quan đến việc kiểm thử. Các điều kiện vận hành. Các hành vi có thể quan sát và xác minh được từ phía người dùng.</w:t>
+            </w:r>
+            <w:r>
+              <w:rPr>
+                <w:rFonts w:ascii="Arial" w:hAnsi="Arial"/>
+                <w:sz w:val="21"/>
+              </w:rPr>
+              <w:br/>
+              <w:t>Quan trọng: Không được tự bịa chức năng, thông số kỹ thuật hoặc hành vi của sản phẩm.</w:t>
+            </w:r>
+            <w:r>
+              <w:rPr>
+                <w:rFonts w:ascii="Arial" w:hAnsi="Arial"/>
+                <w:sz w:val="21"/>
+              </w:rPr>
+              <w:br/>
+              <w:t>2. Xác định phạm vi kiểm thử</w:t>
+            </w:r>
+            <w:r>
+              <w:rPr>
+                <w:rFonts w:ascii="Arial" w:hAnsi="Arial"/>
+                <w:sz w:val="21"/>
+              </w:rPr>
+              <w:br/>
+              <w:t>3. Tạo chính xác 15 Test Case (TC-001 → TC-015). Không được thiếu hoặc thừa.</w:t>
+            </w:r>
+            <w:r>
+              <w:rPr>
+                <w:rFonts w:ascii="Arial" w:hAnsi="Arial"/>
+                <w:sz w:val="21"/>
+              </w:rPr>
+              <w:br/>
+              <w:t xml:space="preserve">4. Format của mỗi Test Case – bắt buộc đủ 9 field: Test Case ID | Test Case Title | Objective | Preconditions | Test Data | Test Steps | Expected Result | Priority | </w:t>
+            </w:r>
+            <w:r>
+              <w:rPr>
+                <w:rFonts w:ascii="Arial" w:hAnsi="Arial"/>
+                <w:sz w:val="21"/>
+              </w:rPr>
+              <w:lastRenderedPageBreak/>
+              <w:t>Test Type</w:t>
+            </w:r>
+            <w:r>
+              <w:rPr>
+                <w:rFonts w:ascii="Arial" w:hAnsi="Arial"/>
+                <w:sz w:val="21"/>
+              </w:rPr>
+              <w:br/>
+              <w:t>5. Quy tắc viết: Test steps đánh số rõ ràng. Expected Result phải cụ thể và có thể xác minh.</w:t>
+            </w:r>
+            <w:r>
+              <w:rPr>
+                <w:rFonts w:ascii="Arial" w:hAnsi="Arial"/>
+                <w:sz w:val="21"/>
+              </w:rPr>
+              <w:br/>
+              <w:t>6. Quality Check trước khi xuất</w:t>
+            </w:r>
+            <w:r>
+              <w:rPr>
+                <w:rFonts w:ascii="Arial" w:hAnsi="Arial"/>
+                <w:sz w:val="21"/>
+              </w:rPr>
+              <w:br/>
+              <w:t>7. Xuất file Markdown tên chính xác: </w:t>
+            </w:r>
+            <w:hyperlink r:id="rId7" w:history="1">
+              <w:r>
+                <w:rPr>
+                  <w:rStyle w:val="Hyperlink"/>
+                  <w:rFonts w:ascii="Arial" w:hAnsi="Arial"/>
+                  <w:b w:val="0"/>
+                  <w:bCs w:val="0"/>
+                  <w:sz w:val="21"/>
+                </w:rPr>
+                <w:t>test-case.md</w:t>
+              </w:r>
+            </w:hyperlink>
+            <w:r>
+              <w:rPr>
+                <w:rFonts w:ascii="Arial" w:hAnsi="Arial"/>
+                <w:sz w:val="21"/>
+              </w:rPr>
+              <w:br/>
             </w:r>
           </w:p>
         </w:tc>
@@ -632,6 +858,83 @@
             <w:pPr>
               <w:cnfStyle w:val="000000100000" w:firstRow="0" w:lastRow="0" w:firstColumn="0" w:lastColumn="0" w:oddVBand="0" w:evenVBand="0" w:oddHBand="1" w:evenHBand="0" w:firstRowFirstColumn="0" w:firstRowLastColumn="0" w:lastRowFirstColumn="0" w:lastRowLastColumn="0"/>
             </w:pPr>
+            <w:r>
+              <w:rPr>
+                <w:rFonts w:ascii="Segoe UI Emoji" w:hAnsi="Segoe UI Emoji" w:cs="Segoe UI Emoji"/>
+              </w:rPr>
+              <w:lastRenderedPageBreak/>
+              <w:t>✅</w:t>
+            </w:r>
+            <w:r>
+              <w:t xml:space="preserve"> Quality check hoàn thành — đúng </w:t>
+            </w:r>
+            <w:r>
+              <w:rPr>
+                <w:b/>
+                <w:bCs/>
+              </w:rPr>
+              <w:t>15 test case</w:t>
+            </w:r>
+            <w:r>
+              <w:t> từ TC-001 đến TC-015.</w:t>
+            </w:r>
+            <w:r>
+              <w:br/>
+            </w:r>
+            <w:r>
+              <w:br/>
+              <w:t>File [test-case.md](file:///d:/Software%20Test</w:t>
+            </w:r>
+            <w:r>
+              <w:lastRenderedPageBreak/>
+              <w:t>ing%20Homework/test-case.md) đã được tạo tại d:\Software Testing Homework\test-case.md.</w:t>
+            </w:r>
+            <w:r>
+              <w:br/>
+            </w:r>
+            <w:r>
+              <w:br/>
+              <w:t>Thông tin sản phẩm thu thập được từ trang web:</w:t>
+            </w:r>
+            <w:r>
+              <w:br/>
+              <w:t>- Model: B5 (5 cánh)</w:t>
+            </w:r>
+            <w:r>
+              <w:br/>
+              <w:t>- Công suất: 65 W</w:t>
+            </w:r>
+            <w:r>
+              <w:br/>
+              <w:t>- Tốc độ quay: 1200 vòng/phút</w:t>
+            </w:r>
+            <w:r>
+              <w:br/>
+              <w:t>- Chiều cao: 130 cm</w:t>
+            </w:r>
+            <w:r>
+              <w:br/>
+              <w:t>- Khối lượng: 6 kg</w:t>
+            </w:r>
+            <w:r>
+              <w:br/>
+              <w:t>- Mức tốc độ: 3 mức + Tắt (núm xoay cơ học)</w:t>
+            </w:r>
+            <w:r>
+              <w:br/>
+              <w:t>- Lồng bảo vệ: Thép không gỉ</w:t>
+            </w:r>
+            <w:r>
+              <w:br/>
+              <w:t>- Bảo hành: 12 tháng chính hãng</w:t>
+            </w:r>
+            <w:r>
+              <w:br/>
+            </w:r>
+            <w:r>
+              <w:br/>
+              <w:t>Phân bổ 15 Test Case: Functional (6), Safety (4), Boundary (2), Robustness (1), Negative (1), Functional-Maintenance (1).</w:t>
+            </w:r>
           </w:p>
         </w:tc>
         <w:tc>
@@ -642,6 +945,10 @@
             <w:pPr>
               <w:cnfStyle w:val="000000100000" w:firstRow="0" w:lastRow="0" w:firstColumn="0" w:lastColumn="0" w:oddVBand="0" w:evenVBand="0" w:oddHBand="1" w:evenHBand="0" w:firstRowFirstColumn="0" w:firstRowLastColumn="0" w:lastRowFirstColumn="0" w:lastRowLastColumn="0"/>
             </w:pPr>
+            <w:r>
+              <w:lastRenderedPageBreak/>
+              <w:t>INCOMPLETE</w:t>
+            </w:r>
           </w:p>
         </w:tc>
         <w:tc>
@@ -652,6 +959,13 @@
             <w:pPr>
               <w:cnfStyle w:val="000000100000" w:firstRow="0" w:lastRow="0" w:firstColumn="0" w:lastColumn="0" w:oddVBand="0" w:evenVBand="0" w:oddHBand="1" w:evenHBand="0" w:firstRowFirstColumn="0" w:firstRowLastColumn="0" w:lastRowFirstColumn="0" w:lastRowLastColumn="0"/>
             </w:pPr>
+            <w:r>
+              <w:t xml:space="preserve">Theo Boundary Value Analysis (ISTQB FL §4.2.2) áp dụng cho IoT/Hardware, test case biên phải bao gồm các khoảng trung gian vật lý. Các test case của AI chỉ kiểm tra trạng thái </w:t>
+            </w:r>
+            <w:r>
+              <w:lastRenderedPageBreak/>
+              <w:t>rời rạc (Bật/Tắt) mà thiếu các rủi ro hao mòn động lực học và sử dụng sai quy cách của người dùng.</w:t>
+            </w:r>
           </w:p>
         </w:tc>
         <w:tc>
@@ -662,6 +976,26 @@
             <w:pPr>
               <w:cnfStyle w:val="000000100000" w:firstRow="0" w:lastRow="0" w:firstColumn="0" w:lastColumn="0" w:oddVBand="0" w:evenVBand="0" w:oddHBand="1" w:evenHBand="0" w:firstRowFirstColumn="0" w:firstRowLastColumn="0" w:lastRowFirstColumn="0" w:lastRowLastColumn="0"/>
             </w:pPr>
+            <w:r>
+              <w:lastRenderedPageBreak/>
+              <w:t>Xóa bỏ các TC thiếu thực tế và bổ sung 3 Edge Cases vật lý:</w:t>
+            </w:r>
+            <w:r>
+              <w:br/>
+              <w:t>+ [TC-009] Kiểm tra chốt khóa bị tụt do độ rung ở Mức 3.</w:t>
+            </w:r>
+            <w:r>
+              <w:br/>
+              <w:t xml:space="preserve">+ [TC-011] Giữ núm điều khiển 'lơ lửng' giữa khấc Mức 1 và </w:t>
+            </w:r>
+            <w:r>
+              <w:lastRenderedPageBreak/>
+              <w:t>Mức 2.</w:t>
+            </w:r>
+            <w:r>
+              <w:br/>
+              <w:t>+ [TC-012] Kiểm tra độ chịu lực điểm nối dây nguồn (Strain Relief).</w:t>
+            </w:r>
           </w:p>
         </w:tc>
       </w:tr>
@@ -680,15 +1014,38 @@
                 <w:rFonts w:ascii="Arial" w:hAnsi="Arial"/>
                 <w:sz w:val="21"/>
               </w:rPr>
-              <w:t>Tool: AI Tool (e.g., ChatGPT, Claude, Gemini)</w:t>
-            </w:r>
-            <w:r>
-              <w:rPr>
-                <w:rFonts w:ascii="Arial" w:hAnsi="Arial"/>
-                <w:sz w:val="21"/>
-              </w:rPr>
-              <w:br/>
-              <w:t>Time: 14:32 25/02/2026</w:t>
+              <w:lastRenderedPageBreak/>
+              <w:t>Tool: </w:t>
+            </w:r>
+            <w:r>
+              <w:rPr>
+                <w:rFonts w:ascii="Arial" w:hAnsi="Arial"/>
+                <w:sz w:val="21"/>
+              </w:rPr>
+              <w:t>Antigravity</w:t>
+            </w:r>
+            <w:r>
+              <w:rPr>
+                <w:rFonts w:ascii="Arial" w:hAnsi="Arial"/>
+                <w:sz w:val="21"/>
+                <w:lang w:val="vi-VN"/>
+              </w:rPr>
+              <w:t xml:space="preserve"> IDE</w:t>
+            </w:r>
+            <w:r>
+              <w:rPr>
+                <w:rFonts w:ascii="Arial" w:hAnsi="Arial"/>
+                <w:sz w:val="21"/>
+              </w:rPr>
+              <w:t xml:space="preserve"> </w:t>
+            </w:r>
+            <w:r>
+              <w:rPr>
+                <w:rFonts w:ascii="Arial" w:hAnsi="Arial"/>
+                <w:sz w:val="21"/>
+              </w:rPr>
+              <w:br/>
+              <w:t>Time: 2026-09-27T07:19:37+07:00</w:t>
             </w:r>
             <w:r>
               <w:rPr>
@@ -704,7 +1061,59 @@
                 <w:sz w:val="21"/>
               </w:rPr>
               <w:br/>
-              <w:t xml:space="preserve">"Generate test </w:t>
+              <w:t>Hãy tạo một mindmap tổng quan về quy trình kiểm thử phần mềm theo hướng dẫn ISTQB và các vai trò QA/QC hiện đại.</w:t>
+            </w:r>
+            <w:r>
+              <w:rPr>
+                <w:rFonts w:ascii="Arial" w:hAnsi="Arial"/>
+                <w:sz w:val="21"/>
+              </w:rPr>
+              <w:br/>
+            </w:r>
+            <w:r>
+              <w:rPr>
+                <w:rFonts w:ascii="Arial" w:hAnsi="Arial"/>
+                <w:sz w:val="21"/>
+              </w:rPr>
+              <w:br/>
+              <w:t>Chủ đề trung tâm: Software Testing – ISTQB &amp; Modern QA/QC</w:t>
+            </w:r>
+            <w:r>
+              <w:rPr>
+                <w:rFonts w:ascii="Arial" w:hAnsi="Arial"/>
+                <w:sz w:val="21"/>
+              </w:rPr>
+              <w:br/>
+            </w:r>
+            <w:r>
+              <w:rPr>
+                <w:rFonts w:ascii="Arial" w:hAnsi="Arial"/>
+                <w:sz w:val="21"/>
+              </w:rPr>
+              <w:br/>
+              <w:t>Nhánh 1 – Quy trình kiểm thử theo ISTQB: Test Planning, Test Analysis, Test Design &amp; Implementation, Test Execution, Evaluating Exit Criteria &amp; Reporting, Test Completion</w:t>
+            </w:r>
+            <w:r>
+              <w:rPr>
+                <w:rFonts w:ascii="Arial" w:hAnsi="Arial"/>
+                <w:sz w:val="21"/>
+              </w:rPr>
+              <w:br/>
+            </w:r>
+            <w:r>
+              <w:rPr>
+                <w:rFonts w:ascii="Arial" w:hAnsi="Arial"/>
+                <w:sz w:val="21"/>
+              </w:rPr>
+              <w:br/>
+              <w:t>Nhánh 2 – Các cấp độ kiểm thử: Unit Testing, Integration Testing, System Testing, Acceptance Testing</w:t>
+            </w:r>
+            <w:r>
+              <w:rPr>
+                <w:rFonts w:ascii="Arial" w:hAnsi="Arial"/>
+                <w:sz w:val="21"/>
+              </w:rPr>
+              <w:br/>
             </w:r>
             <w:r>
               <w:rPr>
@@ -712,7 +1121,75 @@
                 <w:sz w:val="21"/>
               </w:rPr>
               <w:lastRenderedPageBreak/>
-              <w:t>cases for parsePhoneNumberVN function…"</w:t>
+              <w:br/>
+              <w:t>Nhánh 3 – Các loại kiểm thử: Functional (Feature, Regression, Smoke, Sanity) + Non-functional (Performance, Security, Usability, Compatibility, Reliability)</w:t>
+            </w:r>
+            <w:r>
+              <w:rPr>
+                <w:rFonts w:ascii="Arial" w:hAnsi="Arial"/>
+                <w:sz w:val="21"/>
+              </w:rPr>
+              <w:br/>
+            </w:r>
+            <w:r>
+              <w:rPr>
+                <w:rFonts w:ascii="Arial" w:hAnsi="Arial"/>
+                <w:sz w:val="21"/>
+              </w:rPr>
+              <w:br/>
+              <w:t>Nhánh 4 – Kỹ thuật thiết kế kiểm thử: Equivalence Partitioning, Boundary Value Analysis, Decision Table, State Transition, Use Case, Error Guessing, Exploratory</w:t>
+            </w:r>
+            <w:r>
+              <w:rPr>
+                <w:rFonts w:ascii="Arial" w:hAnsi="Arial"/>
+                <w:sz w:val="21"/>
+              </w:rPr>
+              <w:br/>
+            </w:r>
+            <w:r>
+              <w:rPr>
+                <w:rFonts w:ascii="Arial" w:hAnsi="Arial"/>
+                <w:sz w:val="21"/>
+              </w:rPr>
+              <w:br/>
+              <w:t>Nhánh 5 – Vai trò QA/QC hiện đại: QA Engineer, QC/Test Engineer, Automation QA, SDET, Performance Engineer, Security Tester, AI-Augmented QA</w:t>
+            </w:r>
+            <w:r>
+              <w:rPr>
+                <w:rFonts w:ascii="Arial" w:hAnsi="Arial"/>
+                <w:sz w:val="21"/>
+              </w:rPr>
+              <w:br/>
+            </w:r>
+            <w:r>
+              <w:rPr>
+                <w:rFonts w:ascii="Arial" w:hAnsi="Arial"/>
+                <w:sz w:val="21"/>
+              </w:rPr>
+              <w:br/>
+              <w:t>Nhánh 6 – Công cụ: Jira, TestRail, Postman, Selenium, Playwright, Cypress, JMeter, Jenkins, GitHub Actions, AI-assisted Testing</w:t>
+            </w:r>
+            <w:r>
+              <w:rPr>
+                <w:rFonts w:ascii="Arial" w:hAnsi="Arial"/>
+                <w:sz w:val="21"/>
+              </w:rPr>
+              <w:br/>
+            </w:r>
+            <w:r>
+              <w:rPr>
+                <w:rFonts w:ascii="Arial" w:hAnsi="Arial"/>
+                <w:sz w:val="21"/>
+              </w:rPr>
+              <w:br/>
+              <w:t>Xuất file mindmap.md thực tế.</w:t>
+            </w:r>
+            <w:r>
+              <w:rPr>
+                <w:rFonts w:ascii="Arial" w:hAnsi="Arial"/>
+                <w:sz w:val="21"/>
+              </w:rPr>
+              <w:br/>
             </w:r>
           </w:p>
         </w:tc>
@@ -726,34 +1203,93 @@
             </w:pPr>
             <w:r>
               <w:rPr>
-                <w:rFonts w:ascii="Arial" w:hAnsi="Arial"/>
-                <w:sz w:val="21"/>
+                <w:rFonts w:ascii="Segoe UI Emoji" w:hAnsi="Segoe UI Emoji" w:cs="Segoe UI Emoji"/>
               </w:rPr>
               <w:lastRenderedPageBreak/>
-              <w:t>TC01: parsePhoneNumberVN("0912345678")</w:t>
-            </w:r>
-            <w:r>
-              <w:rPr>
-                <w:rFonts w:ascii="Arial" w:hAnsi="Arial"/>
-                <w:sz w:val="21"/>
-              </w:rPr>
-              <w:br/>
-              <w:t>Expected: {prefix:84, number:912345678, valid:true}</w:t>
-            </w:r>
-            <w:r>
-              <w:rPr>
-                <w:rFonts w:ascii="Arial" w:hAnsi="Arial"/>
-                <w:sz w:val="21"/>
-              </w:rPr>
-              <w:br/>
-            </w:r>
-            <w:r>
-              <w:rPr>
-                <w:rFonts w:ascii="Arial" w:hAnsi="Arial"/>
-                <w:sz w:val="21"/>
-              </w:rPr>
+              <w:t>✅</w:t>
+            </w:r>
+            <w:r>
+              <w:t xml:space="preserve"> File [mindmap.md](file:///d:/Software%20Testing%20Homework/mindmap.md) đã được tạo thành công — </w:t>
+            </w:r>
+            <w:r>
+              <w:rPr>
+                <w:b/>
+                <w:bCs/>
+              </w:rPr>
+              <w:t>11,067 bytes</w:t>
+            </w:r>
+            <w:r>
+              <w:t>, </w:t>
+            </w:r>
+            <w:r>
+              <w:rPr>
+                <w:b/>
+                <w:bCs/>
+              </w:rPr>
+              <w:t>119 node/entry</w:t>
+            </w:r>
+            <w:r>
+              <w:t> trong cây phân cấp.</w:t>
+            </w:r>
+            <w:r>
+              <w:br/>
+            </w:r>
+            <w:r>
+              <w:br/>
+              <w:t>File chứa </w:t>
+            </w:r>
+            <w:r>
+              <w:rPr>
+                <w:b/>
+                <w:bCs/>
+              </w:rPr>
+              <w:t>2 định dạng song song</w:t>
+            </w:r>
+            <w:r>
+              <w:t>:</w:t>
+            </w:r>
+            <w:r>
+              <w:br/>
+              <w:t>- Định dạng 1: ASCII Tree Outline (dạng ├── / └──)</w:t>
+            </w:r>
+            <w:r>
+              <w:br/>
+              <w:t>- Định dạng 2: Mermaid Mindmap Syntax (dán vào mermaid.live để render)</w:t>
+            </w:r>
+            <w:r>
+              <w:br/>
+            </w:r>
+            <w:r>
+              <w:br/>
+              <w:t>Cấu trúc 6 nhánh chính:</w:t>
+            </w:r>
+            <w:r>
+              <w:br/>
+              <w:t>- 1. ISTQB Test Process: 6 hoạt động theo trình tự</w:t>
+            </w:r>
+            <w:r>
+              <w:br/>
+              <w:t>- 2. Test Levels: Unit → Integration → System → Acceptance</w:t>
+            </w:r>
+            <w:r>
+              <w:br/>
+              <w:t>- 3. Test Types: Functional (4 loại) + Non-functional (5 loại)</w:t>
+            </w:r>
+            <w:r>
+              <w:br/>
+              <w:t xml:space="preserve">- 4. Test Design </w:t>
+            </w:r>
+            <w:r>
               <w:lastRenderedPageBreak/>
-              <w:t>…</w:t>
+              <w:t>Techniques: 5 Black-box + 2 Experience-based</w:t>
+            </w:r>
+            <w:r>
+              <w:br/>
+              <w:t>- 5. Modern QA/QC Roles: 7 vai trò</w:t>
+            </w:r>
+            <w:r>
+              <w:br/>
+              <w:t>- 6. Tools &amp; Ecosystem: 7 nhóm công cụ</w:t>
             </w:r>
           </w:p>
         </w:tc>
@@ -766,10 +1302,6 @@
               <w:cnfStyle w:val="000000010000" w:firstRow="0" w:lastRow="0" w:firstColumn="0" w:lastColumn="0" w:oddVBand="0" w:evenVBand="0" w:oddHBand="0" w:evenHBand="1" w:firstRowFirstColumn="0" w:firstRowLastColumn="0" w:lastRowFirstColumn="0" w:lastRowLastColumn="0"/>
             </w:pPr>
             <w:r>
-              <w:rPr>
-                <w:rFonts w:ascii="Arial" w:hAnsi="Arial"/>
-                <w:sz w:val="21"/>
-              </w:rPr>
               <w:lastRenderedPageBreak/>
               <w:t>INCOMPLETE</w:t>
             </w:r>
@@ -784,11 +1316,7 @@
               <w:cnfStyle w:val="000000010000" w:firstRow="0" w:lastRow="0" w:firstColumn="0" w:lastColumn="0" w:oddVBand="0" w:evenVBand="0" w:oddHBand="0" w:evenHBand="1" w:firstRowFirstColumn="0" w:firstRowLastColumn="0" w:lastRowFirstColumn="0" w:lastRowLastColumn="0"/>
             </w:pPr>
             <w:r>
-              <w:rPr>
-                <w:rFonts w:ascii="Arial" w:hAnsi="Arial"/>
-                <w:sz w:val="21"/>
-              </w:rPr>
-              <w:t>AI ignored RFC 3966 international format. ISTQB FL §4.3 Boundary Value Analysis requires testing format edges.</w:t>
+              <w:t>AI không phát hiện ra sai sót định nghĩa trong prompt. Theo ISTQB v4.0 (Section 2.2.3), Regression/Smoke là 'Change-related Testing', KHÔNG phải Functional Testing. Sơ đồ cũng hoàn toàn bỏ sót White-box Techniques (Section 4.3).</w:t>
             </w:r>
           </w:p>
         </w:tc>
@@ -801,19 +1329,31 @@
               <w:cnfStyle w:val="000000010000" w:firstRow="0" w:lastRow="0" w:firstColumn="0" w:lastColumn="0" w:oddVBand="0" w:evenVBand="0" w:oddHBand="0" w:evenHBand="1" w:firstRowFirstColumn="0" w:firstRowLastColumn="0" w:lastRowFirstColumn="0" w:lastRowLastColumn="0"/>
             </w:pPr>
             <w:r>
-              <w:rPr>
-                <w:rFonts w:ascii="Arial" w:hAnsi="Arial"/>
-                <w:sz w:val="21"/>
-              </w:rPr>
-              <w:t>Added TC: parsePhoneNumberVN("+84-91-234-5678")</w:t>
-            </w:r>
-            <w:r>
-              <w:rPr>
-                <w:rFonts w:ascii="Arial" w:hAnsi="Arial"/>
-                <w:sz w:val="21"/>
-              </w:rPr>
-              <w:br/>
-              <w:t>Expected: {prefix:84, number:912345678, valid:true}</w:t>
+              <w:t>Sửa lại cấu trúc nhánh trong mã Mermaid:</w:t>
+            </w:r>
+            <w:r>
+              <w:br/>
+              <w:t>- Functional Testing</w:t>
+            </w:r>
+            <w:r>
+              <w:br/>
+              <w:t>- Regression Testing</w:t>
+            </w:r>
+            <w:r>
+              <w:br/>
+              <w:t>+ Change-related Testing</w:t>
+            </w:r>
+            <w:r>
+              <w:br/>
+              <w:t>+ Regression Testing</w:t>
+            </w:r>
+            <w:r>
+              <w:br/>
+              <w:t>+ White-box Techniques</w:t>
+            </w:r>
+            <w:r>
+              <w:br/>
+              <w:t>+ Statement Testing</w:t>
             </w:r>
           </w:p>
         </w:tc>
@@ -828,20 +1368,1562 @@
             <w:tcW w:w="2154" w:type="dxa"/>
           </w:tcPr>
           <w:p>
+            <w:pPr>
+              <w:rPr>
+                <w:lang w:val="vi-VN"/>
+              </w:rPr>
+            </w:pPr>
+            <w:r>
+              <w:rPr>
+                <w:rFonts w:ascii="Arial" w:hAnsi="Arial"/>
+                <w:sz w:val="21"/>
+              </w:rPr>
+              <w:t>Tool: </w:t>
+            </w:r>
+            <w:r>
+              <w:rPr>
+                <w:rFonts w:ascii="Arial" w:hAnsi="Arial"/>
+                <w:sz w:val="21"/>
+              </w:rPr>
+              <w:t>Antigravity</w:t>
+            </w:r>
+            <w:r>
+              <w:rPr>
+                <w:rFonts w:ascii="Arial" w:hAnsi="Arial"/>
+                <w:sz w:val="21"/>
+                <w:lang w:val="vi-VN"/>
+              </w:rPr>
+              <w:t xml:space="preserve"> IDE</w:t>
+            </w:r>
+            <w:r>
+              <w:rPr>
+                <w:rFonts w:ascii="Arial" w:hAnsi="Arial"/>
+                <w:sz w:val="21"/>
+              </w:rPr>
+              <w:t xml:space="preserve"> </w:t>
+            </w:r>
+            <w:r>
+              <w:rPr>
+                <w:rFonts w:ascii="Arial" w:hAnsi="Arial"/>
+                <w:sz w:val="21"/>
+              </w:rPr>
+              <w:br/>
+              <w:t>Time: 2026-09-</w:t>
+            </w:r>
             <w:r>
               <w:rPr>
                 <w:rFonts w:ascii="Arial" w:hAnsi="Arial"/>
                 <w:sz w:val="21"/>
               </w:rPr>
               <w:lastRenderedPageBreak/>
-              <w:t>Artifact #1</w:t>
-            </w:r>
-            <w:r>
-              <w:rPr>
-                <w:rFonts w:ascii="Arial" w:hAnsi="Arial"/>
-                <w:sz w:val="21"/>
-              </w:rPr>
-              <w:br/>
+              <w:t>23T15:47:18Z</w:t>
+            </w:r>
+            <w:r>
+              <w:rPr>
+                <w:rFonts w:ascii="Arial" w:hAnsi="Arial"/>
+                <w:sz w:val="21"/>
+              </w:rPr>
+              <w:br/>
+              <w:t>Prompt:</w:t>
+            </w:r>
+            <w:r>
+              <w:rPr>
+                <w:rFonts w:ascii="Arial" w:hAnsi="Arial"/>
+                <w:sz w:val="21"/>
+              </w:rPr>
+              <w:br/>
+              <w:t>## Requirement 2 – 20 Software Defects 2022–2026 (20 pts)</w:t>
+            </w:r>
+            <w:r>
+              <w:rPr>
+                <w:rFonts w:ascii="Arial" w:hAnsi="Arial"/>
+                <w:sz w:val="21"/>
+              </w:rPr>
+              <w:br/>
+            </w:r>
+            <w:r>
+              <w:rPr>
+                <w:rFonts w:ascii="Arial" w:hAnsi="Arial"/>
+                <w:sz w:val="21"/>
+              </w:rPr>
+              <w:br/>
+              <w:t>### Objective</w:t>
+            </w:r>
+            <w:r>
+              <w:rPr>
+                <w:rFonts w:ascii="Arial" w:hAnsi="Arial"/>
+                <w:sz w:val="21"/>
+              </w:rPr>
+              <w:br/>
+            </w:r>
+            <w:r>
+              <w:rPr>
+                <w:rFonts w:ascii="Arial" w:hAnsi="Arial"/>
+                <w:sz w:val="21"/>
+              </w:rPr>
+              <w:br/>
+              <w:t>Find and document 20 real software defects/vulnerabilities/bugs that were publicly reported between 2022 and 2026.</w:t>
+            </w:r>
+            <w:r>
+              <w:rPr>
+                <w:rFonts w:ascii="Arial" w:hAnsi="Arial"/>
+                <w:sz w:val="21"/>
+              </w:rPr>
+              <w:br/>
+            </w:r>
+            <w:r>
+              <w:rPr>
+                <w:rFonts w:ascii="Arial" w:hAnsi="Arial"/>
+                <w:sz w:val="21"/>
+              </w:rPr>
+              <w:br/>
+              <w:t>The report must be written entirely in Vietnamese, while keeping technical terms, product names, vulnerability IDs (e.g., CVE), and official terminology in English when appropriate.</w:t>
+            </w:r>
+            <w:r>
+              <w:rPr>
+                <w:rFonts w:ascii="Arial" w:hAnsi="Arial"/>
+                <w:sz w:val="21"/>
+              </w:rPr>
+              <w:br/>
+            </w:r>
+            <w:r>
+              <w:rPr>
+                <w:rFonts w:ascii="Arial" w:hAnsi="Arial"/>
+                <w:sz w:val="21"/>
+              </w:rPr>
+              <w:br/>
+              <w:t>### Mandatory Requirements</w:t>
+            </w:r>
+            <w:r>
+              <w:rPr>
+                <w:rFonts w:ascii="Arial" w:hAnsi="Arial"/>
+                <w:sz w:val="21"/>
+              </w:rPr>
+              <w:br/>
+            </w:r>
+            <w:r>
+              <w:rPr>
+                <w:rFonts w:ascii="Arial" w:hAnsi="Arial"/>
+                <w:sz w:val="21"/>
+              </w:rPr>
+              <w:br/>
+              <w:t>#### 1. Number and Time Range</w:t>
+            </w:r>
+            <w:r>
+              <w:rPr>
+                <w:rFonts w:ascii="Arial" w:hAnsi="Arial"/>
+                <w:sz w:val="21"/>
+              </w:rPr>
+              <w:br/>
+            </w:r>
+            <w:r>
+              <w:rPr>
+                <w:rFonts w:ascii="Arial" w:hAnsi="Arial"/>
+                <w:sz w:val="21"/>
+              </w:rPr>
+              <w:br/>
+              <w:t>* Find exactly 20 different software defects.</w:t>
+            </w:r>
+            <w:r>
+              <w:rPr>
+                <w:rFonts w:ascii="Arial" w:hAnsi="Arial"/>
+                <w:sz w:val="21"/>
+              </w:rPr>
+              <w:br/>
+              <w:t>* Each defect must have been publicly disclosed/reported between January 1, 2022 and December 31, 2026.</w:t>
+            </w:r>
+            <w:r>
+              <w:rPr>
+                <w:rFonts w:ascii="Arial" w:hAnsi="Arial"/>
+                <w:sz w:val="21"/>
+              </w:rPr>
+              <w:br/>
+              <w:t>* Do not use the same defect/CVE twice.</w:t>
+            </w:r>
+            <w:r>
+              <w:rPr>
+                <w:rFonts w:ascii="Arial" w:hAnsi="Arial"/>
+                <w:sz w:val="21"/>
+              </w:rPr>
+              <w:br/>
+              <w:t>* Prefer well-documented, real-world defects from reliable sources.</w:t>
+            </w:r>
+            <w:r>
+              <w:rPr>
+                <w:rFonts w:ascii="Arial" w:hAnsi="Arial"/>
+                <w:sz w:val="21"/>
+              </w:rPr>
+              <w:br/>
+            </w:r>
+            <w:r>
+              <w:rPr>
+                <w:rFonts w:ascii="Arial" w:hAnsi="Arial"/>
+                <w:sz w:val="21"/>
+              </w:rPr>
+              <w:lastRenderedPageBreak/>
+              <w:br/>
+              <w:t>#### 2. AI/LLM-Related Defects</w:t>
+            </w:r>
+            <w:r>
+              <w:rPr>
+                <w:rFonts w:ascii="Arial" w:hAnsi="Arial"/>
+                <w:sz w:val="21"/>
+              </w:rPr>
+              <w:br/>
+            </w:r>
+            <w:r>
+              <w:rPr>
+                <w:rFonts w:ascii="Arial" w:hAnsi="Arial"/>
+                <w:sz w:val="21"/>
+              </w:rPr>
+              <w:br/>
+              <w:t>At least 5 of the 20 defects must be directly related to AI/LLM systems, such as:</w:t>
+            </w:r>
+            <w:r>
+              <w:rPr>
+                <w:rFonts w:ascii="Arial" w:hAnsi="Arial"/>
+                <w:sz w:val="21"/>
+              </w:rPr>
+              <w:br/>
+            </w:r>
+            <w:r>
+              <w:rPr>
+                <w:rFonts w:ascii="Arial" w:hAnsi="Arial"/>
+                <w:sz w:val="21"/>
+              </w:rPr>
+              <w:br/>
+              <w:t>* AI/LLM hallucination</w:t>
+            </w:r>
+            <w:r>
+              <w:rPr>
+                <w:rFonts w:ascii="Arial" w:hAnsi="Arial"/>
+                <w:sz w:val="21"/>
+              </w:rPr>
+              <w:br/>
+              <w:t>* Prompt injection</w:t>
+            </w:r>
+            <w:r>
+              <w:rPr>
+                <w:rFonts w:ascii="Arial" w:hAnsi="Arial"/>
+                <w:sz w:val="21"/>
+              </w:rPr>
+              <w:br/>
+              <w:t>* AI bias</w:t>
+            </w:r>
+            <w:r>
+              <w:rPr>
+                <w:rFonts w:ascii="Arial" w:hAnsi="Arial"/>
+                <w:sz w:val="21"/>
+              </w:rPr>
+              <w:br/>
+              <w:t>* Incorrect AI-generated output</w:t>
+            </w:r>
+            <w:r>
+              <w:rPr>
+                <w:rFonts w:ascii="Arial" w:hAnsi="Arial"/>
+                <w:sz w:val="21"/>
+              </w:rPr>
+              <w:br/>
+              <w:t>* AI security vulnerabilities</w:t>
+            </w:r>
+            <w:r>
+              <w:rPr>
+                <w:rFonts w:ascii="Arial" w:hAnsi="Arial"/>
+                <w:sz w:val="21"/>
+              </w:rPr>
+              <w:br/>
+              <w:t>* LLM data leakage or unsafe behavior</w:t>
+            </w:r>
+            <w:r>
+              <w:rPr>
+                <w:rFonts w:ascii="Arial" w:hAnsi="Arial"/>
+                <w:sz w:val="21"/>
+              </w:rPr>
+              <w:br/>
+              <w:t>* AI model/software integration defects</w:t>
+            </w:r>
+            <w:r>
+              <w:rPr>
+                <w:rFonts w:ascii="Arial" w:hAnsi="Arial"/>
+                <w:sz w:val="21"/>
+              </w:rPr>
+              <w:br/>
+            </w:r>
+            <w:r>
+              <w:rPr>
+                <w:rFonts w:ascii="Arial" w:hAnsi="Arial"/>
+                <w:sz w:val="21"/>
+              </w:rPr>
+              <w:br/>
+              <w:t>Clearly mark these entries as AI/LLM-related.</w:t>
+            </w:r>
+            <w:r>
+              <w:rPr>
+                <w:rFonts w:ascii="Arial" w:hAnsi="Arial"/>
+                <w:sz w:val="21"/>
+              </w:rPr>
+              <w:br/>
+            </w:r>
+            <w:r>
+              <w:rPr>
+                <w:rFonts w:ascii="Arial" w:hAnsi="Arial"/>
+                <w:sz w:val="21"/>
+              </w:rPr>
+              <w:br/>
+              <w:t>#### 3. Required Information for EVERY Defect</w:t>
+            </w:r>
+            <w:r>
+              <w:rPr>
+                <w:rFonts w:ascii="Arial" w:hAnsi="Arial"/>
+                <w:sz w:val="21"/>
+              </w:rPr>
+              <w:br/>
+            </w:r>
+            <w:r>
+              <w:rPr>
+                <w:rFonts w:ascii="Arial" w:hAnsi="Arial"/>
+                <w:sz w:val="21"/>
+              </w:rPr>
+              <w:br/>
+              <w:t>For each of the 20 defects, provide:</w:t>
+            </w:r>
+            <w:r>
+              <w:rPr>
+                <w:rFonts w:ascii="Arial" w:hAnsi="Arial"/>
+                <w:sz w:val="21"/>
+              </w:rPr>
+              <w:br/>
+            </w:r>
+            <w:r>
+              <w:rPr>
+                <w:rFonts w:ascii="Arial" w:hAnsi="Arial"/>
+                <w:sz w:val="21"/>
+              </w:rPr>
+              <w:br/>
+              <w:t>1. Tên defect</w:t>
+            </w:r>
+            <w:r>
+              <w:rPr>
+                <w:rFonts w:ascii="Arial" w:hAnsi="Arial"/>
+                <w:sz w:val="21"/>
+              </w:rPr>
+              <w:br/>
+              <w:t>2. Phần mềm / hệ thống bị ảnh hưởng</w:t>
+            </w:r>
+            <w:r>
+              <w:rPr>
+                <w:rFonts w:ascii="Arial" w:hAnsi="Arial"/>
+                <w:sz w:val="21"/>
+              </w:rPr>
+              <w:br/>
+              <w:t>3. Ngày/năm được công bố</w:t>
+            </w:r>
+            <w:r>
+              <w:rPr>
+                <w:rFonts w:ascii="Arial" w:hAnsi="Arial"/>
+                <w:sz w:val="21"/>
+              </w:rPr>
+              <w:br/>
+              <w:t>4. Source link</w:t>
+            </w:r>
+            <w:r>
+              <w:rPr>
+                <w:rFonts w:ascii="Arial" w:hAnsi="Arial"/>
+                <w:sz w:val="21"/>
+              </w:rPr>
+              <w:br/>
+              <w:t>5. Mô tả defect</w:t>
+            </w:r>
+            <w:r>
+              <w:rPr>
+                <w:rFonts w:ascii="Arial" w:hAnsi="Arial"/>
+                <w:sz w:val="21"/>
+              </w:rPr>
+              <w:br/>
+            </w:r>
+            <w:r>
+              <w:rPr>
+                <w:rFonts w:ascii="Arial" w:hAnsi="Arial"/>
+                <w:sz w:val="21"/>
+              </w:rPr>
+              <w:br/>
+              <w:t>* What happened?</w:t>
+            </w:r>
+            <w:r>
+              <w:rPr>
+                <w:rFonts w:ascii="Arial" w:hAnsi="Arial"/>
+                <w:sz w:val="21"/>
+              </w:rPr>
+              <w:br/>
+              <w:t>* What was technically wrong?</w:t>
+            </w:r>
+            <w:r>
+              <w:rPr>
+                <w:rFonts w:ascii="Arial" w:hAnsi="Arial"/>
+                <w:sz w:val="21"/>
+              </w:rPr>
+              <w:br/>
+              <w:t>6. Severity</w:t>
+            </w:r>
+            <w:r>
+              <w:rPr>
+                <w:rFonts w:ascii="Arial" w:hAnsi="Arial"/>
+                <w:sz w:val="21"/>
+              </w:rPr>
+              <w:br/>
+            </w:r>
+            <w:r>
+              <w:rPr>
+                <w:rFonts w:ascii="Arial" w:hAnsi="Arial"/>
+                <w:sz w:val="21"/>
+              </w:rPr>
+              <w:br/>
+              <w:t xml:space="preserve">* Use the severity stated by the authoritative source when </w:t>
+            </w:r>
+            <w:r>
+              <w:rPr>
+                <w:rFonts w:ascii="Arial" w:hAnsi="Arial"/>
+                <w:sz w:val="21"/>
+              </w:rPr>
+              <w:lastRenderedPageBreak/>
+              <w:t>available.</w:t>
+            </w:r>
+            <w:r>
+              <w:rPr>
+                <w:rFonts w:ascii="Arial" w:hAnsi="Arial"/>
+                <w:sz w:val="21"/>
+              </w:rPr>
+              <w:br/>
+              <w:t>* For vulnerabilities, include CVSS score/vector when available.</w:t>
+            </w:r>
+            <w:r>
+              <w:rPr>
+                <w:rFonts w:ascii="Arial" w:hAnsi="Arial"/>
+                <w:sz w:val="21"/>
+              </w:rPr>
+              <w:br/>
+              <w:t>* Do not invent a severity rating.</w:t>
+            </w:r>
+            <w:r>
+              <w:rPr>
+                <w:rFonts w:ascii="Arial" w:hAnsi="Arial"/>
+                <w:sz w:val="21"/>
+              </w:rPr>
+              <w:br/>
+              <w:t>7. Hậu quả / Consequences</w:t>
+            </w:r>
+            <w:r>
+              <w:rPr>
+                <w:rFonts w:ascii="Arial" w:hAnsi="Arial"/>
+                <w:sz w:val="21"/>
+              </w:rPr>
+              <w:br/>
+            </w:r>
+            <w:r>
+              <w:rPr>
+                <w:rFonts w:ascii="Arial" w:hAnsi="Arial"/>
+                <w:sz w:val="21"/>
+              </w:rPr>
+              <w:br/>
+              <w:t>* What could or did happen because of the defect?</w:t>
+            </w:r>
+            <w:r>
+              <w:rPr>
+                <w:rFonts w:ascii="Arial" w:hAnsi="Arial"/>
+                <w:sz w:val="21"/>
+              </w:rPr>
+              <w:br/>
+              <w:t>8. Solution / Mitigation</w:t>
+            </w:r>
+            <w:r>
+              <w:rPr>
+                <w:rFonts w:ascii="Arial" w:hAnsi="Arial"/>
+                <w:sz w:val="21"/>
+              </w:rPr>
+              <w:br/>
+            </w:r>
+            <w:r>
+              <w:rPr>
+                <w:rFonts w:ascii="Arial" w:hAnsi="Arial"/>
+                <w:sz w:val="21"/>
+              </w:rPr>
+              <w:br/>
+              <w:t>* Official patch, update, workaround, configuration change, or mitigation.</w:t>
+            </w:r>
+            <w:r>
+              <w:rPr>
+                <w:rFonts w:ascii="Arial" w:hAnsi="Arial"/>
+                <w:sz w:val="21"/>
+              </w:rPr>
+              <w:br/>
+              <w:t>9. AI Bias/Hallucination Check</w:t>
+            </w:r>
+            <w:r>
+              <w:rPr>
+                <w:rFonts w:ascii="Arial" w:hAnsi="Arial"/>
+                <w:sz w:val="21"/>
+              </w:rPr>
+              <w:br/>
+            </w:r>
+            <w:r>
+              <w:rPr>
+                <w:rFonts w:ascii="Arial" w:hAnsi="Arial"/>
+                <w:sz w:val="21"/>
+              </w:rPr>
+              <w:br/>
+              <w:t>* Ask/analyze the defect using AI.</w:t>
+            </w:r>
+            <w:r>
+              <w:rPr>
+                <w:rFonts w:ascii="Arial" w:hAnsi="Arial"/>
+                <w:sz w:val="21"/>
+              </w:rPr>
+              <w:br/>
+              <w:t>* Identify one specific instance where the AI gives an incorrect, misleading, biased, or hallucinated explanation of that defect.</w:t>
+            </w:r>
+            <w:r>
+              <w:rPr>
+                <w:rFonts w:ascii="Arial" w:hAnsi="Arial"/>
+                <w:sz w:val="21"/>
+              </w:rPr>
+              <w:br/>
+              <w:t>* Explain:</w:t>
+            </w:r>
+            <w:r>
+              <w:rPr>
+                <w:rFonts w:ascii="Arial" w:hAnsi="Arial"/>
+                <w:sz w:val="21"/>
+              </w:rPr>
+              <w:br/>
+            </w:r>
+            <w:r>
+              <w:rPr>
+                <w:rFonts w:ascii="Arial" w:hAnsi="Arial"/>
+                <w:sz w:val="21"/>
+              </w:rPr>
+              <w:br/>
+              <w:t>* What the AI claimed.</w:t>
+            </w:r>
+            <w:r>
+              <w:rPr>
+                <w:rFonts w:ascii="Arial" w:hAnsi="Arial"/>
+                <w:sz w:val="21"/>
+              </w:rPr>
+              <w:br/>
+              <w:t>* Why the claim is incorrect/misleading/biased.</w:t>
+            </w:r>
+            <w:r>
+              <w:rPr>
+                <w:rFonts w:ascii="Arial" w:hAnsi="Arial"/>
+                <w:sz w:val="21"/>
+              </w:rPr>
+              <w:br/>
+              <w:t>* What the verified source says instead.</w:t>
+            </w:r>
+            <w:r>
+              <w:rPr>
+                <w:rFonts w:ascii="Arial" w:hAnsi="Arial"/>
+                <w:sz w:val="21"/>
+              </w:rPr>
+              <w:br/>
+              <w:t xml:space="preserve">* If the AI explanation is correct, do not fabricate a hallucination. Instead, continue </w:t>
+            </w:r>
+            <w:r>
+              <w:rPr>
+                <w:rFonts w:ascii="Arial" w:hAnsi="Arial"/>
+                <w:sz w:val="21"/>
+              </w:rPr>
+              <w:lastRenderedPageBreak/>
+              <w:t>testing/rephrasing the question until a genuine problematic AI response is identified, or explicitly document that no problematic response was found if this cannot be established.</w:t>
+            </w:r>
+            <w:r>
+              <w:rPr>
+                <w:rFonts w:ascii="Arial" w:hAnsi="Arial"/>
+                <w:sz w:val="21"/>
+              </w:rPr>
+              <w:br/>
+            </w:r>
+            <w:r>
+              <w:rPr>
+                <w:rFonts w:ascii="Arial" w:hAnsi="Arial"/>
+                <w:sz w:val="21"/>
+              </w:rPr>
+              <w:br/>
+              <w:t>### IMPORTANT: AI Error Requirement</w:t>
+            </w:r>
+            <w:r>
+              <w:rPr>
+                <w:rFonts w:ascii="Arial" w:hAnsi="Arial"/>
+                <w:sz w:val="21"/>
+              </w:rPr>
+              <w:br/>
+            </w:r>
+            <w:r>
+              <w:rPr>
+                <w:rFonts w:ascii="Arial" w:hAnsi="Arial"/>
+                <w:sz w:val="21"/>
+              </w:rPr>
+              <w:br/>
+              <w:t>The AI bias/hallucination requirement applies to EVERY ONE of the 20 defects.</w:t>
+            </w:r>
+            <w:r>
+              <w:rPr>
+                <w:rFonts w:ascii="Arial" w:hAnsi="Arial"/>
+                <w:sz w:val="21"/>
+              </w:rPr>
+              <w:br/>
+            </w:r>
+            <w:r>
+              <w:rPr>
+                <w:rFonts w:ascii="Arial" w:hAnsi="Arial"/>
+                <w:sz w:val="21"/>
+              </w:rPr>
+              <w:br/>
+              <w:t>Therefore, the final report must contain:</w:t>
+            </w:r>
+            <w:r>
+              <w:rPr>
+                <w:rFonts w:ascii="Arial" w:hAnsi="Arial"/>
+                <w:sz w:val="21"/>
+              </w:rPr>
+              <w:br/>
+            </w:r>
+            <w:r>
+              <w:rPr>
+                <w:rFonts w:ascii="Arial" w:hAnsi="Arial"/>
+                <w:sz w:val="21"/>
+              </w:rPr>
+              <w:br/>
+              <w:t>20 defects = 20 separate AI bias/hallucination instances</w:t>
+            </w:r>
+            <w:r>
+              <w:rPr>
+                <w:rFonts w:ascii="Arial" w:hAnsi="Arial"/>
+                <w:sz w:val="21"/>
+              </w:rPr>
+              <w:br/>
+            </w:r>
+            <w:r>
+              <w:rPr>
+                <w:rFonts w:ascii="Arial" w:hAnsi="Arial"/>
+                <w:sz w:val="21"/>
+              </w:rPr>
+              <w:br/>
+              <w:t>Do NOT provide only one AI hallucination example for the entire report.</w:t>
+            </w:r>
+            <w:r>
+              <w:rPr>
+                <w:rFonts w:ascii="Arial" w:hAnsi="Arial"/>
+                <w:sz w:val="21"/>
+              </w:rPr>
+              <w:br/>
+            </w:r>
+            <w:r>
+              <w:rPr>
+                <w:rFonts w:ascii="Arial" w:hAnsi="Arial"/>
+                <w:sz w:val="21"/>
+              </w:rPr>
+              <w:br/>
+              <w:t>For each defect, include a subsection:</w:t>
+            </w:r>
+            <w:r>
+              <w:rPr>
+                <w:rFonts w:ascii="Arial" w:hAnsi="Arial"/>
+                <w:sz w:val="21"/>
+              </w:rPr>
+              <w:br/>
+            </w:r>
+            <w:r>
+              <w:rPr>
+                <w:rFonts w:ascii="Arial" w:hAnsi="Arial"/>
+                <w:sz w:val="21"/>
+              </w:rPr>
+              <w:br/>
+              <w:t>&gt; AI Bias/Hallucination Instance</w:t>
+            </w:r>
+            <w:r>
+              <w:rPr>
+                <w:rFonts w:ascii="Arial" w:hAnsi="Arial"/>
+                <w:sz w:val="21"/>
+              </w:rPr>
+              <w:br/>
+            </w:r>
+            <w:r>
+              <w:rPr>
+                <w:rFonts w:ascii="Arial" w:hAnsi="Arial"/>
+                <w:sz w:val="21"/>
+              </w:rPr>
+              <w:br/>
+              <w:t>with:</w:t>
+            </w:r>
+            <w:r>
+              <w:rPr>
+                <w:rFonts w:ascii="Arial" w:hAnsi="Arial"/>
+                <w:sz w:val="21"/>
+              </w:rPr>
+              <w:br/>
+            </w:r>
+            <w:r>
+              <w:rPr>
+                <w:rFonts w:ascii="Arial" w:hAnsi="Arial"/>
+                <w:sz w:val="21"/>
+              </w:rPr>
+              <w:br/>
+              <w:t>* AI prompt used</w:t>
+            </w:r>
+            <w:r>
+              <w:rPr>
+                <w:rFonts w:ascii="Arial" w:hAnsi="Arial"/>
+                <w:sz w:val="21"/>
+              </w:rPr>
+              <w:br/>
+              <w:t>* AI response/claim</w:t>
+            </w:r>
+            <w:r>
+              <w:rPr>
+                <w:rFonts w:ascii="Arial" w:hAnsi="Arial"/>
+                <w:sz w:val="21"/>
+              </w:rPr>
+              <w:br/>
+              <w:t xml:space="preserve">* Problem </w:t>
+            </w:r>
+            <w:r>
+              <w:rPr>
+                <w:rFonts w:ascii="Arial" w:hAnsi="Arial"/>
+                <w:sz w:val="21"/>
+              </w:rPr>
+              <w:lastRenderedPageBreak/>
+              <w:t>identified</w:t>
+            </w:r>
+            <w:r>
+              <w:rPr>
+                <w:rFonts w:ascii="Arial" w:hAnsi="Arial"/>
+                <w:sz w:val="21"/>
+              </w:rPr>
+              <w:br/>
+              <w:t>* Verified correction</w:t>
+            </w:r>
+            <w:r>
+              <w:rPr>
+                <w:rFonts w:ascii="Arial" w:hAnsi="Arial"/>
+                <w:sz w:val="21"/>
+              </w:rPr>
+              <w:br/>
+              <w:t>* Evidence/source</w:t>
+            </w:r>
+            <w:r>
+              <w:rPr>
+                <w:rFonts w:ascii="Arial" w:hAnsi="Arial"/>
+                <w:sz w:val="21"/>
+              </w:rPr>
+              <w:br/>
+            </w:r>
+            <w:r>
+              <w:rPr>
+                <w:rFonts w:ascii="Arial" w:hAnsi="Arial"/>
+                <w:sz w:val="21"/>
+              </w:rPr>
+              <w:br/>
+              <w:t>Do not invent an AI response. The reported AI error must be reproducible or clearly documented.</w:t>
+            </w:r>
+            <w:r>
+              <w:rPr>
+                <w:rFonts w:ascii="Arial" w:hAnsi="Arial"/>
+                <w:sz w:val="21"/>
+              </w:rPr>
+              <w:br/>
+            </w:r>
+            <w:r>
+              <w:rPr>
+                <w:rFonts w:ascii="Arial" w:hAnsi="Arial"/>
+                <w:sz w:val="21"/>
+              </w:rPr>
+              <w:br/>
+              <w:t>### 4. Source Requirements</w:t>
+            </w:r>
+            <w:r>
+              <w:rPr>
+                <w:rFonts w:ascii="Arial" w:hAnsi="Arial"/>
+                <w:sz w:val="21"/>
+              </w:rPr>
+              <w:br/>
+            </w:r>
+            <w:r>
+              <w:rPr>
+                <w:rFonts w:ascii="Arial" w:hAnsi="Arial"/>
+                <w:sz w:val="21"/>
+              </w:rPr>
+              <w:br/>
+              <w:t>Source quality is critical.</w:t>
+            </w:r>
+            <w:r>
+              <w:rPr>
+                <w:rFonts w:ascii="Arial" w:hAnsi="Arial"/>
+                <w:sz w:val="21"/>
+              </w:rPr>
+              <w:br/>
+            </w:r>
+            <w:r>
+              <w:rPr>
+                <w:rFonts w:ascii="Arial" w:hAnsi="Arial"/>
+                <w:sz w:val="21"/>
+              </w:rPr>
+              <w:br/>
+              <w:t>For every defect:</w:t>
+            </w:r>
+            <w:r>
+              <w:rPr>
+                <w:rFonts w:ascii="Arial" w:hAnsi="Arial"/>
+                <w:sz w:val="21"/>
+              </w:rPr>
+              <w:br/>
+            </w:r>
+            <w:r>
+              <w:rPr>
+                <w:rFonts w:ascii="Arial" w:hAnsi="Arial"/>
+                <w:sz w:val="21"/>
+              </w:rPr>
+              <w:br/>
+              <w:t>* Provide at least one direct source link supporting the defect.</w:t>
+            </w:r>
+            <w:r>
+              <w:rPr>
+                <w:rFonts w:ascii="Arial" w:hAnsi="Arial"/>
+                <w:sz w:val="21"/>
+              </w:rPr>
+              <w:br/>
+              <w:t>* The link must be accessible at the time of writing (2026).</w:t>
+            </w:r>
+            <w:r>
+              <w:rPr>
+                <w:rFonts w:ascii="Arial" w:hAnsi="Arial"/>
+                <w:sz w:val="21"/>
+              </w:rPr>
+              <w:br/>
+              <w:t>* Open and verify every source before including it.</w:t>
+            </w:r>
+            <w:r>
+              <w:rPr>
+                <w:rFonts w:ascii="Arial" w:hAnsi="Arial"/>
+                <w:sz w:val="21"/>
+              </w:rPr>
+              <w:br/>
+              <w:t>* Do NOT include dead links, inaccessible pages, search-result URLs, or links that only mention the defect indirectly.</w:t>
+            </w:r>
+            <w:r>
+              <w:rPr>
+                <w:rFonts w:ascii="Arial" w:hAnsi="Arial"/>
+                <w:sz w:val="21"/>
+              </w:rPr>
+              <w:br/>
+              <w:t>* Prefer authoritative sources in this order:</w:t>
+            </w:r>
+            <w:r>
+              <w:rPr>
+                <w:rFonts w:ascii="Arial" w:hAnsi="Arial"/>
+                <w:sz w:val="21"/>
+              </w:rPr>
+              <w:br/>
+            </w:r>
+            <w:r>
+              <w:rPr>
+                <w:rFonts w:ascii="Arial" w:hAnsi="Arial"/>
+                <w:sz w:val="21"/>
+              </w:rPr>
+              <w:br/>
+              <w:t>1. Official vendor/security advisory</w:t>
+            </w:r>
+            <w:r>
+              <w:rPr>
+                <w:rFonts w:ascii="Arial" w:hAnsi="Arial"/>
+                <w:sz w:val="21"/>
+              </w:rPr>
+              <w:br/>
+              <w:t>2. CISA / NVD / CVE</w:t>
+            </w:r>
+            <w:r>
+              <w:rPr>
+                <w:rFonts w:ascii="Arial" w:hAnsi="Arial"/>
+                <w:sz w:val="21"/>
+              </w:rPr>
+              <w:br/>
+              <w:t xml:space="preserve">3. Official project repository / release </w:t>
+            </w:r>
+            <w:r>
+              <w:rPr>
+                <w:rFonts w:ascii="Arial" w:hAnsi="Arial"/>
+                <w:sz w:val="21"/>
+              </w:rPr>
+              <w:lastRenderedPageBreak/>
+              <w:t>notes</w:t>
+            </w:r>
+            <w:r>
+              <w:rPr>
+                <w:rFonts w:ascii="Arial" w:hAnsi="Arial"/>
+                <w:sz w:val="21"/>
+              </w:rPr>
+              <w:br/>
+              <w:t>4. Security researcher's original disclosure</w:t>
+            </w:r>
+            <w:r>
+              <w:rPr>
+                <w:rFonts w:ascii="Arial" w:hAnsi="Arial"/>
+                <w:sz w:val="21"/>
+              </w:rPr>
+              <w:br/>
+              <w:t>5. Reputable security/news publication</w:t>
+            </w:r>
+            <w:r>
+              <w:rPr>
+                <w:rFonts w:ascii="Arial" w:hAnsi="Arial"/>
+                <w:sz w:val="21"/>
+              </w:rPr>
+              <w:br/>
+              <w:t>* For AI/LLM defects, prefer original model/vendor documentation, security advisories, research papers, or reputable security research.</w:t>
+            </w:r>
+            <w:r>
+              <w:rPr>
+                <w:rFonts w:ascii="Arial" w:hAnsi="Arial"/>
+                <w:sz w:val="21"/>
+              </w:rPr>
+              <w:br/>
+            </w:r>
+            <w:r>
+              <w:rPr>
+                <w:rFonts w:ascii="Arial" w:hAnsi="Arial"/>
+                <w:sz w:val="21"/>
+              </w:rPr>
+              <w:br/>
+              <w:t>### 5. Verification Rules</w:t>
+            </w:r>
+            <w:r>
+              <w:rPr>
+                <w:rFonts w:ascii="Arial" w:hAnsi="Arial"/>
+                <w:sz w:val="21"/>
+              </w:rPr>
+              <w:br/>
+            </w:r>
+            <w:r>
+              <w:rPr>
+                <w:rFonts w:ascii="Arial" w:hAnsi="Arial"/>
+                <w:sz w:val="21"/>
+              </w:rPr>
+              <w:br/>
+              <w:t>Before adding a defect to the report, verify:</w:t>
+            </w:r>
+            <w:r>
+              <w:rPr>
+                <w:rFonts w:ascii="Arial" w:hAnsi="Arial"/>
+                <w:sz w:val="21"/>
+              </w:rPr>
+              <w:br/>
+            </w:r>
+            <w:r>
+              <w:rPr>
+                <w:rFonts w:ascii="Arial" w:hAnsi="Arial"/>
+                <w:sz w:val="21"/>
+              </w:rPr>
+              <w:br/>
+              <w:t>* [ ] The defect is real.</w:t>
+            </w:r>
+            <w:r>
+              <w:rPr>
+                <w:rFonts w:ascii="Arial" w:hAnsi="Arial"/>
+                <w:sz w:val="21"/>
+              </w:rPr>
+              <w:br/>
+              <w:t>* [ ] It was publicly reported between 2022–2026.</w:t>
+            </w:r>
+            <w:r>
+              <w:rPr>
+                <w:rFonts w:ascii="Arial" w:hAnsi="Arial"/>
+                <w:sz w:val="21"/>
+              </w:rPr>
+              <w:br/>
+              <w:t>* [ ] The source is currently accessible.</w:t>
+            </w:r>
+            <w:r>
+              <w:rPr>
+                <w:rFonts w:ascii="Arial" w:hAnsi="Arial"/>
+                <w:sz w:val="21"/>
+              </w:rPr>
+              <w:br/>
+              <w:t>* [ ] The source actually supports the described defect.</w:t>
+            </w:r>
+            <w:r>
+              <w:rPr>
+                <w:rFonts w:ascii="Arial" w:hAnsi="Arial"/>
+                <w:sz w:val="21"/>
+              </w:rPr>
+              <w:br/>
+              <w:t>* [ ] Severity is supported by a source.</w:t>
+            </w:r>
+            <w:r>
+              <w:rPr>
+                <w:rFonts w:ascii="Arial" w:hAnsi="Arial"/>
+                <w:sz w:val="21"/>
+              </w:rPr>
+              <w:br/>
+              <w:t>* [ ] Consequences are supported by evidence.</w:t>
+            </w:r>
+            <w:r>
+              <w:rPr>
+                <w:rFonts w:ascii="Arial" w:hAnsi="Arial"/>
+                <w:sz w:val="21"/>
+              </w:rPr>
+              <w:br/>
+              <w:t>* [ ] The proposed solution/mitigation is supported by an authoritative source.</w:t>
+            </w:r>
+            <w:r>
+              <w:rPr>
+                <w:rFonts w:ascii="Arial" w:hAnsi="Arial"/>
+                <w:sz w:val="21"/>
+              </w:rPr>
+              <w:br/>
+              <w:t>* [ ] The AI bias/hallucination instance is specific and not fabricated.</w:t>
+            </w:r>
+            <w:r>
+              <w:rPr>
+                <w:rFonts w:ascii="Arial" w:hAnsi="Arial"/>
+                <w:sz w:val="21"/>
+              </w:rPr>
+              <w:br/>
+              <w:t xml:space="preserve">* [ ] No duplicate </w:t>
+            </w:r>
+            <w:r>
+              <w:rPr>
+                <w:rFonts w:ascii="Arial" w:hAnsi="Arial"/>
+                <w:sz w:val="21"/>
+              </w:rPr>
+              <w:lastRenderedPageBreak/>
+              <w:t>defect is included.</w:t>
+            </w:r>
+            <w:r>
+              <w:rPr>
+                <w:rFonts w:ascii="Arial" w:hAnsi="Arial"/>
+                <w:sz w:val="21"/>
+              </w:rPr>
+              <w:br/>
+            </w:r>
+            <w:r>
+              <w:rPr>
+                <w:rFonts w:ascii="Arial" w:hAnsi="Arial"/>
+                <w:sz w:val="21"/>
+              </w:rPr>
+              <w:br/>
+              <w:t>### 6. Recommended Report Format</w:t>
+            </w:r>
+            <w:r>
+              <w:rPr>
+                <w:rFonts w:ascii="Arial" w:hAnsi="Arial"/>
+                <w:sz w:val="21"/>
+              </w:rPr>
+              <w:br/>
+            </w:r>
+            <w:r>
+              <w:rPr>
+                <w:rFonts w:ascii="Arial" w:hAnsi="Arial"/>
+                <w:sz w:val="21"/>
+              </w:rPr>
+              <w:br/>
+              <w:t>Use a table for the main information:</w:t>
+            </w:r>
+            <w:r>
+              <w:rPr>
+                <w:rFonts w:ascii="Arial" w:hAnsi="Arial"/>
+                <w:sz w:val="21"/>
+              </w:rPr>
+              <w:br/>
+            </w:r>
+            <w:r>
+              <w:rPr>
+                <w:rFonts w:ascii="Arial" w:hAnsi="Arial"/>
+                <w:sz w:val="21"/>
+              </w:rPr>
+              <w:br/>
+              <w:t>&amp;#124; # &amp;#124; Defect &amp;#124; Software/System &amp;#124; Year &amp;#124; AI/LLM? &amp;#124; Severity &amp;#124; Consequences &amp;#124; Solution &amp;#124; Source &amp;#124;</w:t>
+            </w:r>
+            <w:r>
+              <w:rPr>
+                <w:rFonts w:ascii="Arial" w:hAnsi="Arial"/>
+                <w:sz w:val="21"/>
+              </w:rPr>
+              <w:br/>
+              <w:t>&amp;#124; - &amp;#124; ------ &amp;#124; --------------- &amp;#124; ---- &amp;#124; ------- &amp;#124; -------- &amp;#124; ------------ &amp;#124; -------- &amp;#124; ------ &amp;#124;</w:t>
+            </w:r>
+            <w:r>
+              <w:rPr>
+                <w:rFonts w:ascii="Arial" w:hAnsi="Arial"/>
+                <w:sz w:val="21"/>
+              </w:rPr>
+              <w:br/>
+            </w:r>
+            <w:r>
+              <w:rPr>
+                <w:rFonts w:ascii="Arial" w:hAnsi="Arial"/>
+                <w:sz w:val="21"/>
+              </w:rPr>
+              <w:br/>
+              <w:t>Then provide detailed information for each defect:</w:t>
+            </w:r>
+            <w:r>
+              <w:rPr>
+                <w:rFonts w:ascii="Arial" w:hAnsi="Arial"/>
+                <w:sz w:val="21"/>
+              </w:rPr>
+              <w:br/>
+            </w:r>
+            <w:r>
+              <w:rPr>
+                <w:rFonts w:ascii="Arial" w:hAnsi="Arial"/>
+                <w:sz w:val="21"/>
+              </w:rPr>
+              <w:br/>
+              <w:t>### Defect 01 – [Name]</w:t>
+            </w:r>
+            <w:r>
+              <w:rPr>
+                <w:rFonts w:ascii="Arial" w:hAnsi="Arial"/>
+                <w:sz w:val="21"/>
+              </w:rPr>
+              <w:br/>
+            </w:r>
+            <w:r>
+              <w:rPr>
+                <w:rFonts w:ascii="Arial" w:hAnsi="Arial"/>
+                <w:sz w:val="21"/>
+              </w:rPr>
+              <w:br/>
+              <w:t>Software/System:</w:t>
+            </w:r>
+            <w:r>
+              <w:rPr>
+                <w:rFonts w:ascii="Arial" w:hAnsi="Arial"/>
+                <w:sz w:val="21"/>
+              </w:rPr>
+              <w:br/>
+              <w:t>Year:</w:t>
+            </w:r>
+            <w:r>
+              <w:rPr>
+                <w:rFonts w:ascii="Arial" w:hAnsi="Arial"/>
+                <w:sz w:val="21"/>
+              </w:rPr>
+              <w:br/>
+              <w:t>AI/LLM-related: Yes/No</w:t>
+            </w:r>
+            <w:r>
+              <w:rPr>
+                <w:rFonts w:ascii="Arial" w:hAnsi="Arial"/>
+                <w:sz w:val="21"/>
+              </w:rPr>
+              <w:br/>
+              <w:t>Severity:</w:t>
+            </w:r>
+            <w:r>
+              <w:rPr>
+                <w:rFonts w:ascii="Arial" w:hAnsi="Arial"/>
+                <w:sz w:val="21"/>
+              </w:rPr>
+              <w:br/>
+              <w:t>Source: [Direct accessible source link]</w:t>
+            </w:r>
+            <w:r>
+              <w:rPr>
+                <w:rFonts w:ascii="Arial" w:hAnsi="Arial"/>
+                <w:sz w:val="21"/>
+              </w:rPr>
+              <w:br/>
+            </w:r>
+            <w:r>
+              <w:rPr>
+                <w:rFonts w:ascii="Arial" w:hAnsi="Arial"/>
+                <w:sz w:val="21"/>
+              </w:rPr>
+              <w:br/>
+              <w:t>Mô tả:</w:t>
+            </w:r>
+            <w:r>
+              <w:rPr>
+                <w:rFonts w:ascii="Arial" w:hAnsi="Arial"/>
+                <w:sz w:val="21"/>
+              </w:rPr>
+              <w:br/>
+              <w:t>...</w:t>
+            </w:r>
+            <w:r>
+              <w:rPr>
+                <w:rFonts w:ascii="Arial" w:hAnsi="Arial"/>
+                <w:sz w:val="21"/>
+              </w:rPr>
+              <w:br/>
+            </w:r>
+            <w:r>
+              <w:rPr>
+                <w:rFonts w:ascii="Arial" w:hAnsi="Arial"/>
+                <w:sz w:val="21"/>
+              </w:rPr>
+              <w:br/>
+              <w:t>Hậu quả:</w:t>
+            </w:r>
+            <w:r>
+              <w:rPr>
+                <w:rFonts w:ascii="Arial" w:hAnsi="Arial"/>
+                <w:sz w:val="21"/>
+              </w:rPr>
+              <w:br/>
+              <w:t>...</w:t>
+            </w:r>
+            <w:r>
+              <w:rPr>
+                <w:rFonts w:ascii="Arial" w:hAnsi="Arial"/>
+                <w:sz w:val="21"/>
+              </w:rPr>
+              <w:br/>
+            </w:r>
+            <w:r>
+              <w:rPr>
+                <w:rFonts w:ascii="Arial" w:hAnsi="Arial"/>
+                <w:sz w:val="21"/>
+              </w:rPr>
+              <w:br/>
+              <w:t>Solution/Mitigation:</w:t>
+            </w:r>
+            <w:r>
+              <w:rPr>
+                <w:rFonts w:ascii="Arial" w:hAnsi="Arial"/>
+                <w:sz w:val="21"/>
+              </w:rPr>
+              <w:br/>
+            </w:r>
+            <w:r>
+              <w:rPr>
+                <w:rFonts w:ascii="Arial" w:hAnsi="Arial"/>
+                <w:sz w:val="21"/>
+              </w:rPr>
+              <w:lastRenderedPageBreak/>
+              <w:t>...</w:t>
+            </w:r>
+            <w:r>
+              <w:rPr>
+                <w:rFonts w:ascii="Arial" w:hAnsi="Arial"/>
+                <w:sz w:val="21"/>
+              </w:rPr>
+              <w:br/>
+            </w:r>
+            <w:r>
+              <w:rPr>
+                <w:rFonts w:ascii="Arial" w:hAnsi="Arial"/>
+                <w:sz w:val="21"/>
+              </w:rPr>
+              <w:br/>
+              <w:t>AI Bias/Hallucination Instance</w:t>
+            </w:r>
+            <w:r>
+              <w:rPr>
+                <w:rFonts w:ascii="Arial" w:hAnsi="Arial"/>
+                <w:sz w:val="21"/>
+              </w:rPr>
+              <w:br/>
+            </w:r>
+            <w:r>
+              <w:rPr>
+                <w:rFonts w:ascii="Arial" w:hAnsi="Arial"/>
+                <w:sz w:val="21"/>
+              </w:rPr>
+              <w:br/>
+              <w:t>Prompt:</w:t>
+            </w:r>
+            <w:r>
+              <w:rPr>
+                <w:rFonts w:ascii="Arial" w:hAnsi="Arial"/>
+                <w:sz w:val="21"/>
+              </w:rPr>
+              <w:br/>
+              <w:t>...</w:t>
+            </w:r>
+            <w:r>
+              <w:rPr>
+                <w:rFonts w:ascii="Arial" w:hAnsi="Arial"/>
+                <w:sz w:val="21"/>
+              </w:rPr>
+              <w:br/>
+            </w:r>
+            <w:r>
+              <w:rPr>
+                <w:rFonts w:ascii="Arial" w:hAnsi="Arial"/>
+                <w:sz w:val="21"/>
+              </w:rPr>
+              <w:br/>
+              <w:t>AI response:</w:t>
+            </w:r>
+            <w:r>
+              <w:rPr>
+                <w:rFonts w:ascii="Arial" w:hAnsi="Arial"/>
+                <w:sz w:val="21"/>
+              </w:rPr>
+              <w:br/>
+              <w:t>...</w:t>
+            </w:r>
+            <w:r>
+              <w:rPr>
+                <w:rFonts w:ascii="Arial" w:hAnsi="Arial"/>
+                <w:sz w:val="21"/>
+              </w:rPr>
+              <w:br/>
+            </w:r>
+            <w:r>
+              <w:rPr>
+                <w:rFonts w:ascii="Arial" w:hAnsi="Arial"/>
+                <w:sz w:val="21"/>
+              </w:rPr>
+              <w:br/>
+              <w:t>Vấn đề:</w:t>
+            </w:r>
+            <w:r>
+              <w:rPr>
+                <w:rFonts w:ascii="Arial" w:hAnsi="Arial"/>
+                <w:sz w:val="21"/>
+              </w:rPr>
+              <w:br/>
+              <w:t>...</w:t>
+            </w:r>
+            <w:r>
+              <w:rPr>
+                <w:rFonts w:ascii="Arial" w:hAnsi="Arial"/>
+                <w:sz w:val="21"/>
+              </w:rPr>
+              <w:br/>
+            </w:r>
+            <w:r>
+              <w:rPr>
+                <w:rFonts w:ascii="Arial" w:hAnsi="Arial"/>
+                <w:sz w:val="21"/>
+              </w:rPr>
+              <w:br/>
+              <w:t>Thông tin đã kiểm chứng:</w:t>
+            </w:r>
+            <w:r>
+              <w:rPr>
+                <w:rFonts w:ascii="Arial" w:hAnsi="Arial"/>
+                <w:sz w:val="21"/>
+              </w:rPr>
+              <w:br/>
+              <w:t>...</w:t>
+            </w:r>
+            <w:r>
+              <w:rPr>
+                <w:rFonts w:ascii="Arial" w:hAnsi="Arial"/>
+                <w:sz w:val="21"/>
+              </w:rPr>
+              <w:br/>
+            </w:r>
+            <w:r>
+              <w:rPr>
+                <w:rFonts w:ascii="Arial" w:hAnsi="Arial"/>
+                <w:sz w:val="21"/>
+              </w:rPr>
+              <w:br/>
+              <w:t>Evidence:</w:t>
+            </w:r>
+            <w:r>
+              <w:rPr>
+                <w:rFonts w:ascii="Arial" w:hAnsi="Arial"/>
+                <w:sz w:val="21"/>
+              </w:rPr>
+              <w:br/>
+              <w:t>...</w:t>
+            </w:r>
+            <w:r>
+              <w:rPr>
+                <w:rFonts w:ascii="Arial" w:hAnsi="Arial"/>
+                <w:sz w:val="21"/>
+              </w:rPr>
+              <w:br/>
+            </w:r>
+            <w:r>
+              <w:rPr>
+                <w:rFonts w:ascii="Arial" w:hAnsi="Arial"/>
+                <w:sz w:val="21"/>
+              </w:rPr>
+              <w:br/>
+              <w:t>Repeat the same structure for all 20 defects.</w:t>
+            </w:r>
+            <w:r>
+              <w:rPr>
+                <w:rFonts w:ascii="Arial" w:hAnsi="Arial"/>
+                <w:sz w:val="21"/>
+              </w:rPr>
+              <w:br/>
+            </w:r>
+            <w:r>
+              <w:rPr>
+                <w:rFonts w:ascii="Arial" w:hAnsi="Arial"/>
+                <w:sz w:val="21"/>
+              </w:rPr>
+              <w:br/>
+              <w:t>### 7. Final Verification Summary</w:t>
+            </w:r>
+            <w:r>
+              <w:rPr>
+                <w:rFonts w:ascii="Arial" w:hAnsi="Arial"/>
+                <w:sz w:val="21"/>
+              </w:rPr>
+              <w:br/>
+            </w:r>
+            <w:r>
+              <w:rPr>
+                <w:rFonts w:ascii="Arial" w:hAnsi="Arial"/>
+                <w:sz w:val="21"/>
+              </w:rPr>
+              <w:br/>
+              <w:t>At the end, provide a checklist:</w:t>
+            </w:r>
+            <w:r>
+              <w:rPr>
+                <w:rFonts w:ascii="Arial" w:hAnsi="Arial"/>
+                <w:sz w:val="21"/>
+              </w:rPr>
+              <w:br/>
+            </w:r>
+            <w:r>
+              <w:rPr>
+                <w:rFonts w:ascii="Arial" w:hAnsi="Arial"/>
+                <w:sz w:val="21"/>
+              </w:rPr>
+              <w:br/>
+              <w:t>* Total defects: 20/20</w:t>
+            </w:r>
+            <w:r>
+              <w:rPr>
+                <w:rFonts w:ascii="Arial" w:hAnsi="Arial"/>
+                <w:sz w:val="21"/>
+              </w:rPr>
+              <w:br/>
+              <w:t>* Defects reported in 2022–2026: 20/20</w:t>
+            </w:r>
+            <w:r>
+              <w:rPr>
+                <w:rFonts w:ascii="Arial" w:hAnsi="Arial"/>
+                <w:sz w:val="21"/>
+              </w:rPr>
+              <w:br/>
+              <w:t>* AI/LLM-related defects: ≥5</w:t>
+            </w:r>
+            <w:r>
+              <w:rPr>
+                <w:rFonts w:ascii="Arial" w:hAnsi="Arial"/>
+                <w:sz w:val="21"/>
+              </w:rPr>
+              <w:br/>
+              <w:t>* AI bias/hallucination instances: 20/20</w:t>
+            </w:r>
+            <w:r>
+              <w:rPr>
+                <w:rFonts w:ascii="Arial" w:hAnsi="Arial"/>
+                <w:sz w:val="21"/>
+              </w:rPr>
+              <w:br/>
+              <w:t>* Defects with verified accessible sources: 20/20</w:t>
+            </w:r>
+            <w:r>
+              <w:rPr>
+                <w:rFonts w:ascii="Arial" w:hAnsi="Arial"/>
+                <w:sz w:val="21"/>
+              </w:rPr>
+              <w:br/>
+              <w:t xml:space="preserve">* Defects with documented severity: 20/20 (or explicitly state when the authoritative source does not </w:t>
+            </w:r>
+            <w:r>
+              <w:rPr>
+                <w:rFonts w:ascii="Arial" w:hAnsi="Arial"/>
+                <w:sz w:val="21"/>
+              </w:rPr>
+              <w:lastRenderedPageBreak/>
+              <w:t>provide a severity rating)</w:t>
+            </w:r>
+            <w:r>
+              <w:rPr>
+                <w:rFonts w:ascii="Arial" w:hAnsi="Arial"/>
+                <w:sz w:val="21"/>
+              </w:rPr>
+              <w:br/>
+              <w:t>* Defects with documented solutions/mitigations: 20/20</w:t>
+            </w:r>
+            <w:r>
+              <w:rPr>
+                <w:rFonts w:ascii="Arial" w:hAnsi="Arial"/>
+                <w:sz w:val="21"/>
+              </w:rPr>
+              <w:br/>
+            </w:r>
+            <w:r>
+              <w:rPr>
+                <w:rFonts w:ascii="Arial" w:hAnsi="Arial"/>
+                <w:sz w:val="21"/>
+              </w:rPr>
+              <w:br/>
+              <w:t>### Critical Instructions</w:t>
+            </w:r>
+            <w:r>
+              <w:rPr>
+                <w:rFonts w:ascii="Arial" w:hAnsi="Arial"/>
+                <w:sz w:val="21"/>
+              </w:rPr>
+              <w:br/>
+            </w:r>
+            <w:r>
+              <w:rPr>
+                <w:rFonts w:ascii="Arial" w:hAnsi="Arial"/>
+                <w:sz w:val="21"/>
+              </w:rPr>
+              <w:br/>
+              <w:t>Do not fabricate sources, defects, CVEs, AI responses, severity ratings, or hallucination examples.</w:t>
+            </w:r>
+            <w:r>
+              <w:rPr>
+                <w:rFonts w:ascii="Arial" w:hAnsi="Arial"/>
+                <w:sz w:val="21"/>
+              </w:rPr>
+              <w:br/>
+            </w:r>
+            <w:r>
+              <w:rPr>
+                <w:rFonts w:ascii="Arial" w:hAnsi="Arial"/>
+                <w:sz w:val="21"/>
+              </w:rPr>
+              <w:br/>
+              <w:t>If a source cannot currently be accessed or verified, do not use it.</w:t>
+            </w:r>
+            <w:r>
+              <w:rPr>
+                <w:rFonts w:ascii="Arial" w:hAnsi="Arial"/>
+                <w:sz w:val="21"/>
+              </w:rPr>
+              <w:br/>
+            </w:r>
+            <w:r>
+              <w:rPr>
+                <w:rFonts w:ascii="Arial" w:hAnsi="Arial"/>
+                <w:sz w:val="21"/>
+              </w:rPr>
+              <w:br/>
+              <w:t>If there is uncertainty about whether something qualifies as a software defect, explain the uncertainty and select a better-documented example instead.</w:t>
+            </w:r>
+            <w:r>
+              <w:rPr>
+                <w:rFonts w:ascii="Arial" w:hAnsi="Arial"/>
+                <w:sz w:val="21"/>
+              </w:rPr>
+              <w:br/>
+            </w:r>
+            <w:r>
+              <w:rPr>
+                <w:rFonts w:ascii="Arial" w:hAnsi="Arial"/>
+                <w:sz w:val="21"/>
+              </w:rPr>
+              <w:br/>
+              <w:t>The final answer must be in Vietnamese, with working source links, and must clearly demonstrate evidence for all 20 defects + 20 individual AI bias/hallucination instances.</w:t>
             </w:r>
             <w:r>
               <w:rPr>
@@ -860,6 +2942,18 @@
             <w:pPr>
               <w:cnfStyle w:val="000000100000" w:firstRow="0" w:lastRow="0" w:firstColumn="0" w:lastColumn="0" w:oddVBand="0" w:evenVBand="0" w:oddHBand="1" w:evenHBand="0" w:firstRowFirstColumn="0" w:firstRowLastColumn="0" w:lastRowFirstColumn="0" w:lastRowLastColumn="0"/>
             </w:pPr>
+            <w:r>
+              <w:lastRenderedPageBreak/>
+              <w:t xml:space="preserve">I'll research and document 20 real software defects </w:t>
+            </w:r>
+            <w:r>
+              <w:lastRenderedPageBreak/>
+              <w:t>(2022–2026) with all required information. Let me start by researching verified sources.</w:t>
+            </w:r>
+            <w:r>
+              <w:br/>
+              <w:t>I now have enough data to write the comprehensive report. Let me compile all 20 defects and write the full Vietnamese report.</w:t>
+            </w:r>
           </w:p>
         </w:tc>
         <w:tc>
@@ -870,6 +2964,10 @@
             <w:pPr>
               <w:cnfStyle w:val="000000100000" w:firstRow="0" w:lastRow="0" w:firstColumn="0" w:lastColumn="0" w:oddVBand="0" w:evenVBand="0" w:oddHBand="1" w:evenHBand="0" w:firstRowFirstColumn="0" w:firstRowLastColumn="0" w:lastRowFirstColumn="0" w:lastRowLastColumn="0"/>
             </w:pPr>
+            <w:r>
+              <w:lastRenderedPageBreak/>
+              <w:t>INCOMPLETE</w:t>
+            </w:r>
           </w:p>
         </w:tc>
         <w:tc>
@@ -880,6 +2978,13 @@
             <w:pPr>
               <w:cnfStyle w:val="000000100000" w:firstRow="0" w:lastRow="0" w:firstColumn="0" w:lastColumn="0" w:oddVBand="0" w:evenVBand="0" w:oddHBand="1" w:evenHBand="0" w:firstRowFirstColumn="0" w:firstRowLastColumn="0" w:lastRowFirstColumn="0" w:lastRowLastColumn="0"/>
             </w:pPr>
+            <w:r>
+              <w:t xml:space="preserve">AI đã không thể tạo ra đầy đủ 20 kịch bản 'AI Hallucination' cho </w:t>
+            </w:r>
+            <w:r>
+              <w:lastRenderedPageBreak/>
+              <w:t>từng defect như yêu cầu của Rubric (buộc phải bẫy AI cho tất cả 20 lỗi), mà nó chỉ liệt kê lại các ví dụ ảo giác chung chung hoặc tự bịa ra ví dụ không có thực chứng. Hướng dẫn môn học yêu cầu phải tự tạo ngữ cảnh để bắt AI nói sai, thay vì ra lệnh cho AI 'tự ảo giác'.</w:t>
+            </w:r>
           </w:p>
         </w:tc>
         <w:tc>
@@ -890,6 +2995,14 @@
             <w:pPr>
               <w:cnfStyle w:val="000000100000" w:firstRow="0" w:lastRow="0" w:firstColumn="0" w:lastColumn="0" w:oddVBand="0" w:evenVBand="0" w:oddHBand="1" w:evenHBand="0" w:firstRowFirstColumn="0" w:firstRowLastColumn="0" w:lastRowFirstColumn="0" w:lastRowLastColumn="0"/>
             </w:pPr>
+            <w:r>
+              <w:lastRenderedPageBreak/>
+              <w:t xml:space="preserve">Tôi đã phải tự tạo context prompt mồi (jailbreak/bias </w:t>
+            </w:r>
+            <w:r>
+              <w:lastRenderedPageBreak/>
+              <w:t>injection) để bẫy AI sinh ra ảo giác cho các lỗi. Sau đó cập nhật thủ công vào bảng phân tích, tuy nhiên do AI an toàn nên tôi chỉ bẫy thành công 9/20 lỗi và chấp nhận bị trừ điểm ở Yêu cầu 2.</w:t>
+            </w:r>
           </w:p>
         </w:tc>
       </w:tr>
@@ -908,7 +3021,99 @@
                 <w:rFonts w:ascii="Arial" w:hAnsi="Arial"/>
                 <w:sz w:val="21"/>
               </w:rPr>
-              <w:t>Artifact #2</w:t>
+              <w:lastRenderedPageBreak/>
+              <w:t>Tool: </w:t>
+            </w:r>
+            <w:r>
+              <w:rPr>
+                <w:rFonts w:ascii="Arial" w:hAnsi="Arial"/>
+                <w:sz w:val="21"/>
+              </w:rPr>
+              <w:t>Antigravity</w:t>
+            </w:r>
+            <w:r>
+              <w:rPr>
+                <w:rFonts w:ascii="Arial" w:hAnsi="Arial"/>
+                <w:sz w:val="21"/>
+                <w:lang w:val="vi-VN"/>
+              </w:rPr>
+              <w:t xml:space="preserve"> IDE</w:t>
+            </w:r>
+            <w:r>
+              <w:rPr>
+                <w:rFonts w:ascii="Arial" w:hAnsi="Arial"/>
+                <w:sz w:val="21"/>
+              </w:rPr>
+              <w:br/>
+              <w:t>Time: 2026-09-23T02:10:56Z</w:t>
+            </w:r>
+            <w:r>
+              <w:rPr>
+                <w:rFonts w:ascii="Arial" w:hAnsi="Arial"/>
+                <w:sz w:val="21"/>
+              </w:rPr>
+              <w:br/>
+              <w:t>Prompt:</w:t>
+            </w:r>
+            <w:r>
+              <w:rPr>
+                <w:rFonts w:ascii="Arial" w:hAnsi="Arial"/>
+                <w:sz w:val="21"/>
+              </w:rPr>
+              <w:br/>
+            </w:r>
+            <w:r>
+              <w:rPr>
+                <w:rFonts w:ascii="Arial" w:hAnsi="Arial"/>
+                <w:sz w:val="21"/>
+              </w:rPr>
+              <w:lastRenderedPageBreak/>
+              <w:t>Read the file \2026.HW01.Jobs.Defects.PhysicalProduct_En.md\ carefully.</w:t>
+            </w:r>
+            <w:r>
+              <w:rPr>
+                <w:rFonts w:ascii="Arial" w:hAnsi="Arial"/>
+                <w:sz w:val="21"/>
+              </w:rPr>
+              <w:br/>
+            </w:r>
+            <w:r>
+              <w:rPr>
+                <w:rFonts w:ascii="Arial" w:hAnsi="Arial"/>
+                <w:sz w:val="21"/>
+              </w:rPr>
+              <w:br/>
+              <w:t>Based on the requirements and instructions in that file, create a detailed outline for the report.</w:t>
+            </w:r>
+            <w:r>
+              <w:rPr>
+                <w:rFonts w:ascii="Arial" w:hAnsi="Arial"/>
+                <w:sz w:val="21"/>
+              </w:rPr>
+              <w:br/>
+            </w:r>
+            <w:r>
+              <w:rPr>
+                <w:rFonts w:ascii="Arial" w:hAnsi="Arial"/>
+                <w:sz w:val="21"/>
+              </w:rPr>
+              <w:br/>
+              <w:t>Then write the report outline into the \report-by-antigraavity\ file.</w:t>
+            </w:r>
+            <w:r>
+              <w:rPr>
+                <w:rFonts w:ascii="Arial" w:hAnsi="Arial"/>
+                <w:sz w:val="21"/>
+              </w:rPr>
+              <w:br/>
+            </w:r>
+            <w:r>
+              <w:rPr>
+                <w:rFonts w:ascii="Arial" w:hAnsi="Arial"/>
+                <w:sz w:val="21"/>
+              </w:rPr>
+              <w:br/>
+              <w:t>Do not write the full report yet. Only create the report structure/outline, including the main sections, subsections, and what should be covered in each section.</w:t>
             </w:r>
             <w:r>
               <w:rPr>
@@ -934,6 +3139,431 @@
             <w:pPr>
               <w:cnfStyle w:val="000000010000" w:firstRow="0" w:lastRow="0" w:firstColumn="0" w:lastColumn="0" w:oddVBand="0" w:evenVBand="0" w:oddHBand="0" w:evenHBand="1" w:firstRowFirstColumn="0" w:firstRowLastColumn="0" w:lastRowFirstColumn="0" w:lastRowLastColumn="0"/>
             </w:pPr>
+            <w:r>
+              <w:lastRenderedPageBreak/>
+              <w:t>The outline has been written to [Report_by_antigravity.md](file:///d:</w:t>
+            </w:r>
+            <w:r>
+              <w:lastRenderedPageBreak/>
+              <w:t>/Software%20Testing%20Homework/Report_by_antigravity.md). Here's a summary of what was created:</w:t>
+            </w:r>
+            <w:r>
+              <w:br/>
+            </w:r>
+            <w:r>
+              <w:br/>
+              <w:t>## Outline Structure</w:t>
+            </w:r>
+            <w:r>
+              <w:br/>
+            </w:r>
+            <w:r>
+              <w:br/>
+              <w:t>The report is organized into </w:t>
+            </w:r>
+            <w:r>
+              <w:rPr>
+                <w:b/>
+                <w:bCs/>
+              </w:rPr>
+              <w:t>5 major sections + appendices</w:t>
+            </w:r>
+            <w:r>
+              <w:t>, mirroring the assignment's rubric exactly:</w:t>
+            </w:r>
+            <w:r>
+              <w:br/>
+            </w:r>
+            <w:r>
+              <w:br/>
+              <w:t>### Req 1 – QA/QC Job Market 2026+ </w:t>
+            </w:r>
+            <w:r>
+              <w:rPr>
+                <w:i/>
+                <w:iCs/>
+              </w:rPr>
+              <w:t>(40 pts)</w:t>
+            </w:r>
+            <w:r>
+              <w:br/>
+              <w:t>- </w:t>
+            </w:r>
+            <w:r>
+              <w:rPr>
+                <w:b/>
+                <w:bCs/>
+              </w:rPr>
+              <w:t>1.0</w:t>
+            </w:r>
+            <w:r>
+              <w:t> – Market overview &amp; skill trends (including the mindmap critique)</w:t>
+            </w:r>
+            <w:r>
+              <w:br/>
+              <w:t>- </w:t>
+            </w:r>
+            <w:r>
+              <w:rPr>
+                <w:b/>
+                <w:bCs/>
+              </w:rPr>
+              <w:t>Summary Table</w:t>
+            </w:r>
+            <w:r>
+              <w:t> – quick reference for all 10 postings</w:t>
+            </w:r>
+            <w:r>
+              <w:br/>
+              <w:t>- </w:t>
+            </w:r>
+            <w:r>
+              <w:rPr>
+                <w:b/>
+                <w:bCs/>
+              </w:rPr>
+              <w:t>1.1 – 1.10</w:t>
+            </w:r>
+            <w:r>
+              <w:t> – Individual job posting entries, each with: link, dated screenshot (with login visible), JD, skills, salary, AI/LLM flag, and 1–2 sentence AI Impact Analysis. 3 of the 10 are pre-flagged as [AI/LLM Required]</w:t>
+            </w:r>
+            <w:r>
+              <w:br/>
+              <w:t>- </w:t>
+            </w:r>
+            <w:r>
+              <w:rPr>
+                <w:b/>
+                <w:bCs/>
+              </w:rPr>
+              <w:t>1.11</w:t>
+            </w:r>
+            <w:r>
+              <w:t> – Synthesis: what AI replaces / assists / cannot replace</w:t>
+            </w:r>
+            <w:r>
+              <w:br/>
+            </w:r>
+            <w:r>
+              <w:br/>
+              <w:t xml:space="preserve">### Req 2 – 20 Software Defects </w:t>
+            </w:r>
+            <w:r>
+              <w:lastRenderedPageBreak/>
+              <w:t>2022–2026 </w:t>
+            </w:r>
+            <w:r>
+              <w:rPr>
+                <w:i/>
+                <w:iCs/>
+              </w:rPr>
+              <w:t>(20 pts)</w:t>
+            </w:r>
+            <w:r>
+              <w:br/>
+              <w:t>- </w:t>
+            </w:r>
+            <w:r>
+              <w:rPr>
+                <w:b/>
+                <w:bCs/>
+              </w:rPr>
+              <w:t>2.0</w:t>
+            </w:r>
+            <w:r>
+              <w:t> – Scope overview + summary table</w:t>
+            </w:r>
+            <w:r>
+              <w:br/>
+              <w:t>- </w:t>
+            </w:r>
+            <w:r>
+              <w:rPr>
+                <w:b/>
+                <w:bCs/>
+              </w:rPr>
+              <w:t>2.1 – 2.15</w:t>
+            </w:r>
+            <w:r>
+              <w:t> – Traditional/general defects</w:t>
+            </w:r>
+            <w:r>
+              <w:br/>
+              <w:t>- </w:t>
+            </w:r>
+            <w:r>
+              <w:rPr>
+                <w:b/>
+                <w:bCs/>
+              </w:rPr>
+              <w:t>2.16 – 2.20</w:t>
+            </w:r>
+            <w:r>
+              <w:t> – AI/LLM-related defects (hallucination, prompt injection, bias) — satisfying the ≥ 5 requirement</w:t>
+            </w:r>
+            <w:r>
+              <w:br/>
+              <w:t>- Every entry includes the mandatory </w:t>
+            </w:r>
+            <w:r>
+              <w:rPr>
+                <w:b/>
+                <w:bCs/>
+              </w:rPr>
+              <w:t>AI Bias/Hallucination Check</w:t>
+            </w:r>
+            <w:r>
+              <w:t> (prompt → AI output → identified error → student correction)</w:t>
+            </w:r>
+            <w:r>
+              <w:br/>
+              <w:t>- </w:t>
+            </w:r>
+            <w:r>
+              <w:rPr>
+                <w:b/>
+                <w:bCs/>
+              </w:rPr>
+              <w:t>2.21</w:t>
+            </w:r>
+            <w:r>
+              <w:t> – Summary table confirming counts</w:t>
+            </w:r>
+            <w:r>
+              <w:br/>
+            </w:r>
+            <w:r>
+              <w:br/>
+              <w:t>### Req 3 – Physical Product Testing </w:t>
+            </w:r>
+            <w:r>
+              <w:rPr>
+                <w:i/>
+                <w:iCs/>
+              </w:rPr>
+              <w:t>(40 pts)</w:t>
+            </w:r>
+            <w:r>
+              <w:br/>
+              <w:t>- </w:t>
+            </w:r>
+            <w:r>
+              <w:rPr>
+                <w:b/>
+                <w:bCs/>
+              </w:rPr>
+              <w:t>3.0</w:t>
+            </w:r>
+            <w:r>
+              <w:t> – Device declaration (photo, brand, model, serial number)</w:t>
+            </w:r>
+            <w:r>
+              <w:br/>
+              <w:t>- </w:t>
+            </w:r>
+            <w:r>
+              <w:rPr>
+                <w:b/>
+                <w:bCs/>
+              </w:rPr>
+              <w:t>3.1</w:t>
+            </w:r>
+            <w:r>
+              <w:t> – ISTQB Mindmap + 3 mistakes found</w:t>
+            </w:r>
+            <w:r>
+              <w:br/>
+              <w:t>- </w:t>
+            </w:r>
+            <w:r>
+              <w:rPr>
+                <w:b/>
+                <w:bCs/>
+              </w:rPr>
+              <w:t>3.2</w:t>
+            </w:r>
+            <w:r>
+              <w:t> – AI-generated baseline test cases</w:t>
+            </w:r>
+            <w:r>
+              <w:br/>
+              <w:t>- </w:t>
+            </w:r>
+            <w:r>
+              <w:rPr>
+                <w:b/>
+                <w:bCs/>
+              </w:rPr>
+              <w:t>3.3</w:t>
+            </w:r>
+            <w:r>
+              <w:t> – TC-01 to TC-15, with [VIDEO] tags on ≥ 5 and [EDGE-CASE: Student-Original] on ≥ 3 (with AI-miss evidence)</w:t>
+            </w:r>
+            <w:r>
+              <w:br/>
+              <w:t>- </w:t>
+            </w:r>
+            <w:r>
+              <w:rPr>
+                <w:b/>
+                <w:bCs/>
+              </w:rPr>
+              <w:t>3.4</w:t>
+            </w:r>
+            <w:r>
+              <w:t xml:space="preserve"> – DEF-01 to DEF-05+ (GitHub </w:t>
+            </w:r>
+            <w:r>
+              <w:lastRenderedPageBreak/>
+              <w:t>Issues)</w:t>
+            </w:r>
+            <w:r>
+              <w:br/>
+              <w:t>- </w:t>
+            </w:r>
+            <w:r>
+              <w:rPr>
+                <w:b/>
+                <w:bCs/>
+              </w:rPr>
+              <w:t>3.5</w:t>
+            </w:r>
+            <w:r>
+              <w:t> – Edge case analysis: why AI missed them</w:t>
+            </w:r>
+            <w:r>
+              <w:br/>
+              <w:t>- </w:t>
+            </w:r>
+            <w:r>
+              <w:rPr>
+                <w:b/>
+                <w:bCs/>
+              </w:rPr>
+              <w:t>3.6</w:t>
+            </w:r>
+            <w:r>
+              <w:t> – Test execution summary table + video links</w:t>
+            </w:r>
+            <w:r>
+              <w:br/>
+            </w:r>
+            <w:r>
+              <w:br/>
+              <w:t>### AI Collaboration </w:t>
+            </w:r>
+            <w:r>
+              <w:rPr>
+                <w:i/>
+                <w:iCs/>
+              </w:rPr>
+              <w:t>(mandatory)</w:t>
+            </w:r>
+            <w:r>
+              <w:br/>
+              <w:t>- </w:t>
+            </w:r>
+            <w:r>
+              <w:rPr>
+                <w:b/>
+                <w:bCs/>
+              </w:rPr>
+              <w:t>AI.1</w:t>
+            </w:r>
+            <w:r>
+              <w:t> – AI Audit Report using the 5-section [L1]–[L5] template per artifact, plus accuracy ratio summary</w:t>
+            </w:r>
+            <w:r>
+              <w:br/>
+              <w:t>- </w:t>
+            </w:r>
+            <w:r>
+              <w:rPr>
+                <w:b/>
+                <w:bCs/>
+              </w:rPr>
+              <w:t>AI.2</w:t>
+            </w:r>
+            <w:r>
+              <w:t> – AI Critique (200–300 words)</w:t>
+            </w:r>
+            <w:r>
+              <w:br/>
+              <w:t>- </w:t>
+            </w:r>
+            <w:r>
+              <w:rPr>
+                <w:b/>
+                <w:bCs/>
+              </w:rPr>
+              <w:t>AI.3</w:t>
+            </w:r>
+            <w:r>
+              <w:t> – Mandatory Disclosure Statement</w:t>
+            </w:r>
+            <w:r>
+              <w:br/>
+            </w:r>
+            <w:r>
+              <w:br/>
+              <w:t>### Supporting Sections</w:t>
+            </w:r>
+            <w:r>
+              <w:br/>
+              <w:t>- </w:t>
+            </w:r>
+            <w:r>
+              <w:rPr>
+                <w:b/>
+                <w:bCs/>
+              </w:rPr>
+              <w:t>Self-Assessment Table</w:t>
+            </w:r>
+            <w:r>
+              <w:t> — matches the rubric exactly</w:t>
+            </w:r>
+            <w:r>
+              <w:br/>
+              <w:t>- </w:t>
+            </w:r>
+            <w:r>
+              <w:rPr>
+                <w:b/>
+                <w:bCs/>
+              </w:rPr>
+              <w:t>References</w:t>
+            </w:r>
+            <w:r>
+              <w:t> — all 6 required sources + URLs</w:t>
+            </w:r>
+            <w:r>
+              <w:br/>
+              <w:t>- </w:t>
+            </w:r>
+            <w:r>
+              <w:rPr>
+                <w:b/>
+                <w:bCs/>
+              </w:rPr>
+              <w:t>Appendices A–H</w:t>
+            </w:r>
+            <w:r>
+              <w:t> — prompt log, audit forms, mindmap, Excel ref, GitHub issues, video links</w:t>
+            </w:r>
+            <w:r>
+              <w:br/>
+              <w:t>- </w:t>
+            </w:r>
+            <w:r>
+              <w:rPr>
+                <w:b/>
+                <w:bCs/>
+              </w:rPr>
+              <w:t>Submission Checklist</w:t>
+            </w:r>
+            <w:r>
+              <w:t> — 12-item verification list before zipping</w:t>
+            </w:r>
           </w:p>
         </w:tc>
         <w:tc>
@@ -944,6 +3574,10 @@
             <w:pPr>
               <w:cnfStyle w:val="000000010000" w:firstRow="0" w:lastRow="0" w:firstColumn="0" w:lastColumn="0" w:oddVBand="0" w:evenVBand="0" w:oddHBand="0" w:evenHBand="1" w:firstRowFirstColumn="0" w:firstRowLastColumn="0" w:lastRowFirstColumn="0" w:lastRowLastColumn="0"/>
             </w:pPr>
+            <w:r>
+              <w:lastRenderedPageBreak/>
+              <w:t>VALID</w:t>
+            </w:r>
           </w:p>
         </w:tc>
         <w:tc>
@@ -954,6 +3588,13 @@
             <w:pPr>
               <w:cnfStyle w:val="000000010000" w:firstRow="0" w:lastRow="0" w:firstColumn="0" w:lastColumn="0" w:oddVBand="0" w:evenVBand="0" w:oddHBand="0" w:evenHBand="1" w:firstRowFirstColumn="0" w:firstRowLastColumn="0" w:lastRowFirstColumn="0" w:lastRowLastColumn="0"/>
             </w:pPr>
+            <w:r>
+              <w:t xml:space="preserve">AI đã bám sát 100% tài liệu hướng dẫn (Rubric) được cung cấp để tạo ra cấu trúc </w:t>
+            </w:r>
+            <w:r>
+              <w:lastRenderedPageBreak/>
+              <w:t>Outline hoàn chỉnh gồm 5 mục chính và các Phụ lục. Cấu trúc này logic, chính xác, không hề bịa đặt (hallucinate) các yêu cầu ngoài lề và được tôi sử dụng nguyên bản cho toàn bộ báo cáo.</w:t>
+            </w:r>
           </w:p>
         </w:tc>
         <w:tc>
@@ -964,598 +3605,14 @@
             <w:pPr>
               <w:cnfStyle w:val="000000010000" w:firstRow="0" w:lastRow="0" w:firstColumn="0" w:lastColumn="0" w:oddVBand="0" w:evenVBand="0" w:oddHBand="0" w:evenHBand="1" w:firstRowFirstColumn="0" w:firstRowLastColumn="0" w:lastRowFirstColumn="0" w:lastRowLastColumn="0"/>
             </w:pPr>
-          </w:p>
-        </w:tc>
-      </w:tr>
-      <w:tr>
-        <w:trPr>
-          <w:cnfStyle w:val="000000100000" w:firstRow="0" w:lastRow="0" w:firstColumn="0" w:lastColumn="0" w:oddVBand="0" w:evenVBand="0" w:oddHBand="1" w:evenHBand="0" w:firstRowFirstColumn="0" w:firstRowLastColumn="0" w:lastRowFirstColumn="0" w:lastRowLastColumn="0"/>
-        </w:trPr>
-        <w:tc>
-          <w:tcPr>
-            <w:cnfStyle w:val="001000000000" w:firstRow="0" w:lastRow="0" w:firstColumn="1" w:lastColumn="0" w:oddVBand="0" w:evenVBand="0" w:oddHBand="0" w:evenHBand="0" w:firstRowFirstColumn="0" w:firstRowLastColumn="0" w:lastRowFirstColumn="0" w:lastRowLastColumn="0"/>
-            <w:tcW w:w="2154" w:type="dxa"/>
-          </w:tcPr>
-          <w:p>
-            <w:r>
-              <w:rPr>
-                <w:rFonts w:ascii="Arial" w:hAnsi="Arial"/>
-                <w:sz w:val="21"/>
-              </w:rPr>
-              <w:t>Artifact #3</w:t>
-            </w:r>
-            <w:r>
-              <w:rPr>
-                <w:rFonts w:ascii="Arial" w:hAnsi="Arial"/>
-                <w:sz w:val="21"/>
-              </w:rPr>
-              <w:br/>
-            </w:r>
-            <w:r>
-              <w:rPr>
-                <w:rFonts w:ascii="Arial" w:hAnsi="Arial"/>
-                <w:sz w:val="21"/>
-              </w:rPr>
-              <w:br/>
-            </w:r>
-          </w:p>
-        </w:tc>
-        <w:tc>
-          <w:tcPr>
-            <w:tcW w:w="2041" w:type="dxa"/>
-          </w:tcPr>
-          <w:p>
-            <w:pPr>
-              <w:cnfStyle w:val="000000100000" w:firstRow="0" w:lastRow="0" w:firstColumn="0" w:lastColumn="0" w:oddVBand="0" w:evenVBand="0" w:oddHBand="1" w:evenHBand="0" w:firstRowFirstColumn="0" w:firstRowLastColumn="0" w:lastRowFirstColumn="0" w:lastRowLastColumn="0"/>
-            </w:pPr>
-          </w:p>
-        </w:tc>
-        <w:tc>
-          <w:tcPr>
-            <w:tcW w:w="1020" w:type="dxa"/>
-          </w:tcPr>
-          <w:p>
-            <w:pPr>
-              <w:cnfStyle w:val="000000100000" w:firstRow="0" w:lastRow="0" w:firstColumn="0" w:lastColumn="0" w:oddVBand="0" w:evenVBand="0" w:oddHBand="1" w:evenHBand="0" w:firstRowFirstColumn="0" w:firstRowLastColumn="0" w:lastRowFirstColumn="0" w:lastRowLastColumn="0"/>
-            </w:pPr>
-          </w:p>
-        </w:tc>
-        <w:tc>
-          <w:tcPr>
-            <w:tcW w:w="2268" w:type="dxa"/>
-          </w:tcPr>
-          <w:p>
-            <w:pPr>
-              <w:cnfStyle w:val="000000100000" w:firstRow="0" w:lastRow="0" w:firstColumn="0" w:lastColumn="0" w:oddVBand="0" w:evenVBand="0" w:oddHBand="1" w:evenHBand="0" w:firstRowFirstColumn="0" w:firstRowLastColumn="0" w:lastRowFirstColumn="0" w:lastRowLastColumn="0"/>
-            </w:pPr>
-          </w:p>
-        </w:tc>
-        <w:tc>
-          <w:tcPr>
-            <w:tcW w:w="2154" w:type="dxa"/>
-          </w:tcPr>
-          <w:p>
-            <w:pPr>
-              <w:cnfStyle w:val="000000100000" w:firstRow="0" w:lastRow="0" w:firstColumn="0" w:lastColumn="0" w:oddVBand="0" w:evenVBand="0" w:oddHBand="1" w:evenHBand="0" w:firstRowFirstColumn="0" w:firstRowLastColumn="0" w:lastRowFirstColumn="0" w:lastRowLastColumn="0"/>
-            </w:pPr>
-          </w:p>
-        </w:tc>
-      </w:tr>
-      <w:tr>
-        <w:trPr>
-          <w:cnfStyle w:val="000000010000" w:firstRow="0" w:lastRow="0" w:firstColumn="0" w:lastColumn="0" w:oddVBand="0" w:evenVBand="0" w:oddHBand="0" w:evenHBand="1" w:firstRowFirstColumn="0" w:firstRowLastColumn="0" w:lastRowFirstColumn="0" w:lastRowLastColumn="0"/>
-        </w:trPr>
-        <w:tc>
-          <w:tcPr>
-            <w:cnfStyle w:val="001000000000" w:firstRow="0" w:lastRow="0" w:firstColumn="1" w:lastColumn="0" w:oddVBand="0" w:evenVBand="0" w:oddHBand="0" w:evenHBand="0" w:firstRowFirstColumn="0" w:firstRowLastColumn="0" w:lastRowFirstColumn="0" w:lastRowLastColumn="0"/>
-            <w:tcW w:w="2154" w:type="dxa"/>
-          </w:tcPr>
-          <w:p>
-            <w:r>
-              <w:rPr>
-                <w:rFonts w:ascii="Arial" w:hAnsi="Arial"/>
-                <w:sz w:val="21"/>
-              </w:rPr>
-              <w:t>Artifact #4</w:t>
-            </w:r>
-            <w:r>
-              <w:rPr>
-                <w:rFonts w:ascii="Arial" w:hAnsi="Arial"/>
-                <w:sz w:val="21"/>
-              </w:rPr>
-              <w:br/>
-            </w:r>
-            <w:r>
-              <w:rPr>
-                <w:rFonts w:ascii="Arial" w:hAnsi="Arial"/>
-                <w:sz w:val="21"/>
-              </w:rPr>
-              <w:br/>
-            </w:r>
-          </w:p>
-        </w:tc>
-        <w:tc>
-          <w:tcPr>
-            <w:tcW w:w="2041" w:type="dxa"/>
-          </w:tcPr>
-          <w:p>
-            <w:pPr>
-              <w:cnfStyle w:val="000000010000" w:firstRow="0" w:lastRow="0" w:firstColumn="0" w:lastColumn="0" w:oddVBand="0" w:evenVBand="0" w:oddHBand="0" w:evenHBand="1" w:firstRowFirstColumn="0" w:firstRowLastColumn="0" w:lastRowFirstColumn="0" w:lastRowLastColumn="0"/>
-            </w:pPr>
-          </w:p>
-        </w:tc>
-        <w:tc>
-          <w:tcPr>
-            <w:tcW w:w="1020" w:type="dxa"/>
-          </w:tcPr>
-          <w:p>
-            <w:pPr>
-              <w:cnfStyle w:val="000000010000" w:firstRow="0" w:lastRow="0" w:firstColumn="0" w:lastColumn="0" w:oddVBand="0" w:evenVBand="0" w:oddHBand="0" w:evenHBand="1" w:firstRowFirstColumn="0" w:firstRowLastColumn="0" w:lastRowFirstColumn="0" w:lastRowLastColumn="0"/>
-            </w:pPr>
-          </w:p>
-        </w:tc>
-        <w:tc>
-          <w:tcPr>
-            <w:tcW w:w="2268" w:type="dxa"/>
-          </w:tcPr>
-          <w:p>
-            <w:pPr>
-              <w:cnfStyle w:val="000000010000" w:firstRow="0" w:lastRow="0" w:firstColumn="0" w:lastColumn="0" w:oddVBand="0" w:evenVBand="0" w:oddHBand="0" w:evenHBand="1" w:firstRowFirstColumn="0" w:firstRowLastColumn="0" w:lastRowFirstColumn="0" w:lastRowLastColumn="0"/>
-            </w:pPr>
-          </w:p>
-        </w:tc>
-        <w:tc>
-          <w:tcPr>
-            <w:tcW w:w="2154" w:type="dxa"/>
-          </w:tcPr>
-          <w:p>
-            <w:pPr>
-              <w:cnfStyle w:val="000000010000" w:firstRow="0" w:lastRow="0" w:firstColumn="0" w:lastColumn="0" w:oddVBand="0" w:evenVBand="0" w:oddHBand="0" w:evenHBand="1" w:firstRowFirstColumn="0" w:firstRowLastColumn="0" w:lastRowFirstColumn="0" w:lastRowLastColumn="0"/>
-            </w:pPr>
-          </w:p>
-        </w:tc>
-      </w:tr>
-      <w:tr>
-        <w:trPr>
-          <w:cnfStyle w:val="000000100000" w:firstRow="0" w:lastRow="0" w:firstColumn="0" w:lastColumn="0" w:oddVBand="0" w:evenVBand="0" w:oddHBand="1" w:evenHBand="0" w:firstRowFirstColumn="0" w:firstRowLastColumn="0" w:lastRowFirstColumn="0" w:lastRowLastColumn="0"/>
-        </w:trPr>
-        <w:tc>
-          <w:tcPr>
-            <w:cnfStyle w:val="001000000000" w:firstRow="0" w:lastRow="0" w:firstColumn="1" w:lastColumn="0" w:oddVBand="0" w:evenVBand="0" w:oddHBand="0" w:evenHBand="0" w:firstRowFirstColumn="0" w:firstRowLastColumn="0" w:lastRowFirstColumn="0" w:lastRowLastColumn="0"/>
-            <w:tcW w:w="2154" w:type="dxa"/>
-          </w:tcPr>
-          <w:p>
-            <w:r>
-              <w:rPr>
-                <w:rFonts w:ascii="Arial" w:hAnsi="Arial"/>
-                <w:sz w:val="21"/>
-              </w:rPr>
-              <w:t>Artifact #5</w:t>
-            </w:r>
-            <w:r>
-              <w:rPr>
-                <w:rFonts w:ascii="Arial" w:hAnsi="Arial"/>
-                <w:sz w:val="21"/>
-              </w:rPr>
-              <w:br/>
-            </w:r>
-            <w:r>
-              <w:rPr>
-                <w:rFonts w:ascii="Arial" w:hAnsi="Arial"/>
-                <w:sz w:val="21"/>
-              </w:rPr>
-              <w:br/>
-            </w:r>
-          </w:p>
-        </w:tc>
-        <w:tc>
-          <w:tcPr>
-            <w:tcW w:w="2041" w:type="dxa"/>
-          </w:tcPr>
-          <w:p>
-            <w:pPr>
-              <w:cnfStyle w:val="000000100000" w:firstRow="0" w:lastRow="0" w:firstColumn="0" w:lastColumn="0" w:oddVBand="0" w:evenVBand="0" w:oddHBand="1" w:evenHBand="0" w:firstRowFirstColumn="0" w:firstRowLastColumn="0" w:lastRowFirstColumn="0" w:lastRowLastColumn="0"/>
-            </w:pPr>
-          </w:p>
-        </w:tc>
-        <w:tc>
-          <w:tcPr>
-            <w:tcW w:w="1020" w:type="dxa"/>
-          </w:tcPr>
-          <w:p>
-            <w:pPr>
-              <w:cnfStyle w:val="000000100000" w:firstRow="0" w:lastRow="0" w:firstColumn="0" w:lastColumn="0" w:oddVBand="0" w:evenVBand="0" w:oddHBand="1" w:evenHBand="0" w:firstRowFirstColumn="0" w:firstRowLastColumn="0" w:lastRowFirstColumn="0" w:lastRowLastColumn="0"/>
-            </w:pPr>
-          </w:p>
-        </w:tc>
-        <w:tc>
-          <w:tcPr>
-            <w:tcW w:w="2268" w:type="dxa"/>
-          </w:tcPr>
-          <w:p>
-            <w:pPr>
-              <w:cnfStyle w:val="000000100000" w:firstRow="0" w:lastRow="0" w:firstColumn="0" w:lastColumn="0" w:oddVBand="0" w:evenVBand="0" w:oddHBand="1" w:evenHBand="0" w:firstRowFirstColumn="0" w:firstRowLastColumn="0" w:lastRowFirstColumn="0" w:lastRowLastColumn="0"/>
-            </w:pPr>
-          </w:p>
-        </w:tc>
-        <w:tc>
-          <w:tcPr>
-            <w:tcW w:w="2154" w:type="dxa"/>
-          </w:tcPr>
-          <w:p>
-            <w:pPr>
-              <w:cnfStyle w:val="000000100000" w:firstRow="0" w:lastRow="0" w:firstColumn="0" w:lastColumn="0" w:oddVBand="0" w:evenVBand="0" w:oddHBand="1" w:evenHBand="0" w:firstRowFirstColumn="0" w:firstRowLastColumn="0" w:lastRowFirstColumn="0" w:lastRowLastColumn="0"/>
-            </w:pPr>
-          </w:p>
-        </w:tc>
-      </w:tr>
-      <w:tr>
-        <w:trPr>
-          <w:cnfStyle w:val="000000010000" w:firstRow="0" w:lastRow="0" w:firstColumn="0" w:lastColumn="0" w:oddVBand="0" w:evenVBand="0" w:oddHBand="0" w:evenHBand="1" w:firstRowFirstColumn="0" w:firstRowLastColumn="0" w:lastRowFirstColumn="0" w:lastRowLastColumn="0"/>
-        </w:trPr>
-        <w:tc>
-          <w:tcPr>
-            <w:cnfStyle w:val="001000000000" w:firstRow="0" w:lastRow="0" w:firstColumn="1" w:lastColumn="0" w:oddVBand="0" w:evenVBand="0" w:oddHBand="0" w:evenHBand="0" w:firstRowFirstColumn="0" w:firstRowLastColumn="0" w:lastRowFirstColumn="0" w:lastRowLastColumn="0"/>
-            <w:tcW w:w="2154" w:type="dxa"/>
-          </w:tcPr>
-          <w:p>
-            <w:r>
-              <w:rPr>
-                <w:rFonts w:ascii="Arial" w:hAnsi="Arial"/>
-                <w:sz w:val="21"/>
-              </w:rPr>
-              <w:t>Artifact #6</w:t>
-            </w:r>
-            <w:r>
-              <w:rPr>
-                <w:rFonts w:ascii="Arial" w:hAnsi="Arial"/>
-                <w:sz w:val="21"/>
-              </w:rPr>
-              <w:br/>
-            </w:r>
-            <w:r>
-              <w:rPr>
-                <w:rFonts w:ascii="Arial" w:hAnsi="Arial"/>
-                <w:sz w:val="21"/>
-              </w:rPr>
-              <w:br/>
-            </w:r>
-          </w:p>
-        </w:tc>
-        <w:tc>
-          <w:tcPr>
-            <w:tcW w:w="2041" w:type="dxa"/>
-          </w:tcPr>
-          <w:p>
-            <w:pPr>
-              <w:cnfStyle w:val="000000010000" w:firstRow="0" w:lastRow="0" w:firstColumn="0" w:lastColumn="0" w:oddVBand="0" w:evenVBand="0" w:oddHBand="0" w:evenHBand="1" w:firstRowFirstColumn="0" w:firstRowLastColumn="0" w:lastRowFirstColumn="0" w:lastRowLastColumn="0"/>
-            </w:pPr>
-          </w:p>
-        </w:tc>
-        <w:tc>
-          <w:tcPr>
-            <w:tcW w:w="1020" w:type="dxa"/>
-          </w:tcPr>
-          <w:p>
-            <w:pPr>
-              <w:cnfStyle w:val="000000010000" w:firstRow="0" w:lastRow="0" w:firstColumn="0" w:lastColumn="0" w:oddVBand="0" w:evenVBand="0" w:oddHBand="0" w:evenHBand="1" w:firstRowFirstColumn="0" w:firstRowLastColumn="0" w:lastRowFirstColumn="0" w:lastRowLastColumn="0"/>
-            </w:pPr>
-          </w:p>
-        </w:tc>
-        <w:tc>
-          <w:tcPr>
-            <w:tcW w:w="2268" w:type="dxa"/>
-          </w:tcPr>
-          <w:p>
-            <w:pPr>
-              <w:cnfStyle w:val="000000010000" w:firstRow="0" w:lastRow="0" w:firstColumn="0" w:lastColumn="0" w:oddVBand="0" w:evenVBand="0" w:oddHBand="0" w:evenHBand="1" w:firstRowFirstColumn="0" w:firstRowLastColumn="0" w:lastRowFirstColumn="0" w:lastRowLastColumn="0"/>
-            </w:pPr>
-          </w:p>
-        </w:tc>
-        <w:tc>
-          <w:tcPr>
-            <w:tcW w:w="2154" w:type="dxa"/>
-          </w:tcPr>
-          <w:p>
-            <w:pPr>
-              <w:cnfStyle w:val="000000010000" w:firstRow="0" w:lastRow="0" w:firstColumn="0" w:lastColumn="0" w:oddVBand="0" w:evenVBand="0" w:oddHBand="0" w:evenHBand="1" w:firstRowFirstColumn="0" w:firstRowLastColumn="0" w:lastRowFirstColumn="0" w:lastRowLastColumn="0"/>
-            </w:pPr>
-          </w:p>
-        </w:tc>
-      </w:tr>
-      <w:tr>
-        <w:trPr>
-          <w:cnfStyle w:val="000000100000" w:firstRow="0" w:lastRow="0" w:firstColumn="0" w:lastColumn="0" w:oddVBand="0" w:evenVBand="0" w:oddHBand="1" w:evenHBand="0" w:firstRowFirstColumn="0" w:firstRowLastColumn="0" w:lastRowFirstColumn="0" w:lastRowLastColumn="0"/>
-        </w:trPr>
-        <w:tc>
-          <w:tcPr>
-            <w:cnfStyle w:val="001000000000" w:firstRow="0" w:lastRow="0" w:firstColumn="1" w:lastColumn="0" w:oddVBand="0" w:evenVBand="0" w:oddHBand="0" w:evenHBand="0" w:firstRowFirstColumn="0" w:firstRowLastColumn="0" w:lastRowFirstColumn="0" w:lastRowLastColumn="0"/>
-            <w:tcW w:w="2154" w:type="dxa"/>
-          </w:tcPr>
-          <w:p>
-            <w:r>
-              <w:rPr>
-                <w:rFonts w:ascii="Arial" w:hAnsi="Arial"/>
-                <w:sz w:val="21"/>
-              </w:rPr>
-              <w:t>Artifact #7</w:t>
-            </w:r>
-            <w:r>
-              <w:rPr>
-                <w:rFonts w:ascii="Arial" w:hAnsi="Arial"/>
-                <w:sz w:val="21"/>
-              </w:rPr>
-              <w:br/>
-            </w:r>
-            <w:r>
-              <w:rPr>
-                <w:rFonts w:ascii="Arial" w:hAnsi="Arial"/>
-                <w:sz w:val="21"/>
-              </w:rPr>
-              <w:br/>
-            </w:r>
-          </w:p>
-        </w:tc>
-        <w:tc>
-          <w:tcPr>
-            <w:tcW w:w="2041" w:type="dxa"/>
-          </w:tcPr>
-          <w:p>
-            <w:pPr>
-              <w:cnfStyle w:val="000000100000" w:firstRow="0" w:lastRow="0" w:firstColumn="0" w:lastColumn="0" w:oddVBand="0" w:evenVBand="0" w:oddHBand="1" w:evenHBand="0" w:firstRowFirstColumn="0" w:firstRowLastColumn="0" w:lastRowFirstColumn="0" w:lastRowLastColumn="0"/>
-            </w:pPr>
-          </w:p>
-        </w:tc>
-        <w:tc>
-          <w:tcPr>
-            <w:tcW w:w="1020" w:type="dxa"/>
-          </w:tcPr>
-          <w:p>
-            <w:pPr>
-              <w:cnfStyle w:val="000000100000" w:firstRow="0" w:lastRow="0" w:firstColumn="0" w:lastColumn="0" w:oddVBand="0" w:evenVBand="0" w:oddHBand="1" w:evenHBand="0" w:firstRowFirstColumn="0" w:firstRowLastColumn="0" w:lastRowFirstColumn="0" w:lastRowLastColumn="0"/>
-            </w:pPr>
-          </w:p>
-        </w:tc>
-        <w:tc>
-          <w:tcPr>
-            <w:tcW w:w="2268" w:type="dxa"/>
-          </w:tcPr>
-          <w:p>
-            <w:pPr>
-              <w:cnfStyle w:val="000000100000" w:firstRow="0" w:lastRow="0" w:firstColumn="0" w:lastColumn="0" w:oddVBand="0" w:evenVBand="0" w:oddHBand="1" w:evenHBand="0" w:firstRowFirstColumn="0" w:firstRowLastColumn="0" w:lastRowFirstColumn="0" w:lastRowLastColumn="0"/>
-            </w:pPr>
-          </w:p>
-        </w:tc>
-        <w:tc>
-          <w:tcPr>
-            <w:tcW w:w="2154" w:type="dxa"/>
-          </w:tcPr>
-          <w:p>
-            <w:pPr>
-              <w:cnfStyle w:val="000000100000" w:firstRow="0" w:lastRow="0" w:firstColumn="0" w:lastColumn="0" w:oddVBand="0" w:evenVBand="0" w:oddHBand="1" w:evenHBand="0" w:firstRowFirstColumn="0" w:firstRowLastColumn="0" w:lastRowFirstColumn="0" w:lastRowLastColumn="0"/>
-            </w:pPr>
-          </w:p>
-        </w:tc>
-      </w:tr>
-      <w:tr>
-        <w:trPr>
-          <w:cnfStyle w:val="000000010000" w:firstRow="0" w:lastRow="0" w:firstColumn="0" w:lastColumn="0" w:oddVBand="0" w:evenVBand="0" w:oddHBand="0" w:evenHBand="1" w:firstRowFirstColumn="0" w:firstRowLastColumn="0" w:lastRowFirstColumn="0" w:lastRowLastColumn="0"/>
-        </w:trPr>
-        <w:tc>
-          <w:tcPr>
-            <w:cnfStyle w:val="001000000000" w:firstRow="0" w:lastRow="0" w:firstColumn="1" w:lastColumn="0" w:oddVBand="0" w:evenVBand="0" w:oddHBand="0" w:evenHBand="0" w:firstRowFirstColumn="0" w:firstRowLastColumn="0" w:lastRowFirstColumn="0" w:lastRowLastColumn="0"/>
-            <w:tcW w:w="2154" w:type="dxa"/>
-          </w:tcPr>
-          <w:p>
-            <w:r>
-              <w:rPr>
-                <w:rFonts w:ascii="Arial" w:hAnsi="Arial"/>
-                <w:sz w:val="21"/>
-              </w:rPr>
-              <w:t>Artifact #8</w:t>
-            </w:r>
-            <w:r>
-              <w:rPr>
-                <w:rFonts w:ascii="Arial" w:hAnsi="Arial"/>
-                <w:sz w:val="21"/>
-              </w:rPr>
-              <w:br/>
-            </w:r>
-            <w:r>
-              <w:rPr>
-                <w:rFonts w:ascii="Arial" w:hAnsi="Arial"/>
-                <w:sz w:val="21"/>
-              </w:rPr>
-              <w:br/>
-            </w:r>
-          </w:p>
-        </w:tc>
-        <w:tc>
-          <w:tcPr>
-            <w:tcW w:w="2041" w:type="dxa"/>
-          </w:tcPr>
-          <w:p>
-            <w:pPr>
-              <w:cnfStyle w:val="000000010000" w:firstRow="0" w:lastRow="0" w:firstColumn="0" w:lastColumn="0" w:oddVBand="0" w:evenVBand="0" w:oddHBand="0" w:evenHBand="1" w:firstRowFirstColumn="0" w:firstRowLastColumn="0" w:lastRowFirstColumn="0" w:lastRowLastColumn="0"/>
-            </w:pPr>
-          </w:p>
-        </w:tc>
-        <w:tc>
-          <w:tcPr>
-            <w:tcW w:w="1020" w:type="dxa"/>
-          </w:tcPr>
-          <w:p>
-            <w:pPr>
-              <w:cnfStyle w:val="000000010000" w:firstRow="0" w:lastRow="0" w:firstColumn="0" w:lastColumn="0" w:oddVBand="0" w:evenVBand="0" w:oddHBand="0" w:evenHBand="1" w:firstRowFirstColumn="0" w:firstRowLastColumn="0" w:lastRowFirstColumn="0" w:lastRowLastColumn="0"/>
-            </w:pPr>
-          </w:p>
-        </w:tc>
-        <w:tc>
-          <w:tcPr>
-            <w:tcW w:w="2268" w:type="dxa"/>
-          </w:tcPr>
-          <w:p>
-            <w:pPr>
-              <w:cnfStyle w:val="000000010000" w:firstRow="0" w:lastRow="0" w:firstColumn="0" w:lastColumn="0" w:oddVBand="0" w:evenVBand="0" w:oddHBand="0" w:evenHBand="1" w:firstRowFirstColumn="0" w:firstRowLastColumn="0" w:lastRowFirstColumn="0" w:lastRowLastColumn="0"/>
-            </w:pPr>
-          </w:p>
-        </w:tc>
-        <w:tc>
-          <w:tcPr>
-            <w:tcW w:w="2154" w:type="dxa"/>
-          </w:tcPr>
-          <w:p>
-            <w:pPr>
-              <w:cnfStyle w:val="000000010000" w:firstRow="0" w:lastRow="0" w:firstColumn="0" w:lastColumn="0" w:oddVBand="0" w:evenVBand="0" w:oddHBand="0" w:evenHBand="1" w:firstRowFirstColumn="0" w:firstRowLastColumn="0" w:lastRowFirstColumn="0" w:lastRowLastColumn="0"/>
-            </w:pPr>
-          </w:p>
-        </w:tc>
-      </w:tr>
-      <w:tr>
-        <w:trPr>
-          <w:cnfStyle w:val="000000100000" w:firstRow="0" w:lastRow="0" w:firstColumn="0" w:lastColumn="0" w:oddVBand="0" w:evenVBand="0" w:oddHBand="1" w:evenHBand="0" w:firstRowFirstColumn="0" w:firstRowLastColumn="0" w:lastRowFirstColumn="0" w:lastRowLastColumn="0"/>
-        </w:trPr>
-        <w:tc>
-          <w:tcPr>
-            <w:cnfStyle w:val="001000000000" w:firstRow="0" w:lastRow="0" w:firstColumn="1" w:lastColumn="0" w:oddVBand="0" w:evenVBand="0" w:oddHBand="0" w:evenHBand="0" w:firstRowFirstColumn="0" w:firstRowLastColumn="0" w:lastRowFirstColumn="0" w:lastRowLastColumn="0"/>
-            <w:tcW w:w="2154" w:type="dxa"/>
-          </w:tcPr>
-          <w:p>
-            <w:r>
-              <w:rPr>
-                <w:rFonts w:ascii="Arial" w:hAnsi="Arial"/>
-                <w:sz w:val="21"/>
-              </w:rPr>
-              <w:t>Artifact #9</w:t>
-            </w:r>
-            <w:r>
-              <w:rPr>
-                <w:rFonts w:ascii="Arial" w:hAnsi="Arial"/>
-                <w:sz w:val="21"/>
-              </w:rPr>
-              <w:br/>
-            </w:r>
-            <w:r>
-              <w:rPr>
-                <w:rFonts w:ascii="Arial" w:hAnsi="Arial"/>
-                <w:sz w:val="21"/>
-              </w:rPr>
-              <w:br/>
-            </w:r>
-          </w:p>
-        </w:tc>
-        <w:tc>
-          <w:tcPr>
-            <w:tcW w:w="2041" w:type="dxa"/>
-          </w:tcPr>
-          <w:p>
-            <w:pPr>
-              <w:cnfStyle w:val="000000100000" w:firstRow="0" w:lastRow="0" w:firstColumn="0" w:lastColumn="0" w:oddVBand="0" w:evenVBand="0" w:oddHBand="1" w:evenHBand="0" w:firstRowFirstColumn="0" w:firstRowLastColumn="0" w:lastRowFirstColumn="0" w:lastRowLastColumn="0"/>
-            </w:pPr>
-          </w:p>
-        </w:tc>
-        <w:tc>
-          <w:tcPr>
-            <w:tcW w:w="1020" w:type="dxa"/>
-          </w:tcPr>
-          <w:p>
-            <w:pPr>
-              <w:cnfStyle w:val="000000100000" w:firstRow="0" w:lastRow="0" w:firstColumn="0" w:lastColumn="0" w:oddVBand="0" w:evenVBand="0" w:oddHBand="1" w:evenHBand="0" w:firstRowFirstColumn="0" w:firstRowLastColumn="0" w:lastRowFirstColumn="0" w:lastRowLastColumn="0"/>
-            </w:pPr>
-          </w:p>
-        </w:tc>
-        <w:tc>
-          <w:tcPr>
-            <w:tcW w:w="2268" w:type="dxa"/>
-          </w:tcPr>
-          <w:p>
-            <w:pPr>
-              <w:cnfStyle w:val="000000100000" w:firstRow="0" w:lastRow="0" w:firstColumn="0" w:lastColumn="0" w:oddVBand="0" w:evenVBand="0" w:oddHBand="1" w:evenHBand="0" w:firstRowFirstColumn="0" w:firstRowLastColumn="0" w:lastRowFirstColumn="0" w:lastRowLastColumn="0"/>
-            </w:pPr>
-          </w:p>
-        </w:tc>
-        <w:tc>
-          <w:tcPr>
-            <w:tcW w:w="2154" w:type="dxa"/>
-          </w:tcPr>
-          <w:p>
-            <w:pPr>
-              <w:cnfStyle w:val="000000100000" w:firstRow="0" w:lastRow="0" w:firstColumn="0" w:lastColumn="0" w:oddVBand="0" w:evenVBand="0" w:oddHBand="1" w:evenHBand="0" w:firstRowFirstColumn="0" w:firstRowLastColumn="0" w:lastRowFirstColumn="0" w:lastRowLastColumn="0"/>
-            </w:pPr>
-          </w:p>
-        </w:tc>
-      </w:tr>
-      <w:tr>
-        <w:trPr>
-          <w:cnfStyle w:val="000000010000" w:firstRow="0" w:lastRow="0" w:firstColumn="0" w:lastColumn="0" w:oddVBand="0" w:evenVBand="0" w:oddHBand="0" w:evenHBand="1" w:firstRowFirstColumn="0" w:firstRowLastColumn="0" w:lastRowFirstColumn="0" w:lastRowLastColumn="0"/>
-        </w:trPr>
-        <w:tc>
-          <w:tcPr>
-            <w:cnfStyle w:val="001000000000" w:firstRow="0" w:lastRow="0" w:firstColumn="1" w:lastColumn="0" w:oddVBand="0" w:evenVBand="0" w:oddHBand="0" w:evenHBand="0" w:firstRowFirstColumn="0" w:firstRowLastColumn="0" w:lastRowFirstColumn="0" w:lastRowLastColumn="0"/>
-            <w:tcW w:w="2154" w:type="dxa"/>
-          </w:tcPr>
-          <w:p>
-            <w:r>
-              <w:rPr>
-                <w:rFonts w:ascii="Arial" w:hAnsi="Arial"/>
-                <w:sz w:val="21"/>
-              </w:rPr>
-              <w:t>Artifact #10</w:t>
-            </w:r>
-            <w:r>
-              <w:rPr>
-                <w:rFonts w:ascii="Arial" w:hAnsi="Arial"/>
-                <w:sz w:val="21"/>
-              </w:rPr>
-              <w:br/>
-            </w:r>
-            <w:r>
-              <w:rPr>
-                <w:rFonts w:ascii="Arial" w:hAnsi="Arial"/>
-                <w:sz w:val="21"/>
-              </w:rPr>
-              <w:br/>
-            </w:r>
-          </w:p>
-        </w:tc>
-        <w:tc>
-          <w:tcPr>
-            <w:tcW w:w="2041" w:type="dxa"/>
-          </w:tcPr>
-          <w:p>
-            <w:pPr>
-              <w:cnfStyle w:val="000000010000" w:firstRow="0" w:lastRow="0" w:firstColumn="0" w:lastColumn="0" w:oddVBand="0" w:evenVBand="0" w:oddHBand="0" w:evenHBand="1" w:firstRowFirstColumn="0" w:firstRowLastColumn="0" w:lastRowFirstColumn="0" w:lastRowLastColumn="0"/>
-            </w:pPr>
-          </w:p>
-        </w:tc>
-        <w:tc>
-          <w:tcPr>
-            <w:tcW w:w="1020" w:type="dxa"/>
-          </w:tcPr>
-          <w:p>
-            <w:pPr>
-              <w:cnfStyle w:val="000000010000" w:firstRow="0" w:lastRow="0" w:firstColumn="0" w:lastColumn="0" w:oddVBand="0" w:evenVBand="0" w:oddHBand="0" w:evenHBand="1" w:firstRowFirstColumn="0" w:firstRowLastColumn="0" w:lastRowFirstColumn="0" w:lastRowLastColumn="0"/>
-            </w:pPr>
-          </w:p>
-        </w:tc>
-        <w:tc>
-          <w:tcPr>
-            <w:tcW w:w="2268" w:type="dxa"/>
-          </w:tcPr>
-          <w:p>
-            <w:pPr>
-              <w:cnfStyle w:val="000000010000" w:firstRow="0" w:lastRow="0" w:firstColumn="0" w:lastColumn="0" w:oddVBand="0" w:evenVBand="0" w:oddHBand="0" w:evenHBand="1" w:firstRowFirstColumn="0" w:firstRowLastColumn="0" w:lastRowFirstColumn="0" w:lastRowLastColumn="0"/>
-            </w:pPr>
-          </w:p>
-        </w:tc>
-        <w:tc>
-          <w:tcPr>
-            <w:tcW w:w="2154" w:type="dxa"/>
-          </w:tcPr>
-          <w:p>
-            <w:pPr>
-              <w:cnfStyle w:val="000000010000" w:firstRow="0" w:lastRow="0" w:firstColumn="0" w:lastColumn="0" w:oddVBand="0" w:evenVBand="0" w:oddHBand="0" w:evenHBand="1" w:firstRowFirstColumn="0" w:firstRowLastColumn="0" w:lastRowFirstColumn="0" w:lastRowLastColumn="0"/>
-            </w:pPr>
+            <w:r>
+              <w:lastRenderedPageBreak/>
+              <w:t xml:space="preserve">(Không cần chỉnh sửa vì AI đã xuất sắc hoàn thành việc tạo khung sườn cho báo </w:t>
+            </w:r>
+            <w:r>
+              <w:lastRenderedPageBreak/>
+              <w:t>cáo. Kết quả được chấp nhận sử dụng trực tiếp).</w:t>
+            </w:r>
           </w:p>
         </w:tc>
       </w:tr>
@@ -1568,6 +3625,7 @@
         <w:rPr>
           <w:rFonts w:ascii="Arial" w:hAnsi="Arial"/>
         </w:rPr>
+        <w:lastRenderedPageBreak/>
         <w:t>4. Summary of AI Accuracy</w:t>
       </w:r>
     </w:p>
@@ -1678,6 +3736,9 @@
             <w:pPr>
               <w:cnfStyle w:val="000000100000" w:firstRow="0" w:lastRow="0" w:firstColumn="0" w:lastColumn="0" w:oddVBand="0" w:evenVBand="0" w:oddHBand="1" w:evenHBand="0" w:firstRowFirstColumn="0" w:firstRowLastColumn="0" w:lastRowFirstColumn="0" w:lastRowLastColumn="0"/>
             </w:pPr>
+            <w:r>
+              <w:t>4</w:t>
+            </w:r>
           </w:p>
         </w:tc>
         <w:tc>
@@ -1706,6 +3767,7 @@
                 <w:rFonts w:ascii="Arial" w:hAnsi="Arial"/>
                 <w:sz w:val="21"/>
               </w:rPr>
+              <w:lastRenderedPageBreak/>
               <w:t>VALID (correct, accepted as-is)</w:t>
             </w:r>
           </w:p>
@@ -1718,6 +3780,9 @@
             <w:pPr>
               <w:cnfStyle w:val="000000010000" w:firstRow="0" w:lastRow="0" w:firstColumn="0" w:lastColumn="0" w:oddVBand="0" w:evenVBand="0" w:oddHBand="0" w:evenHBand="1" w:firstRowFirstColumn="0" w:firstRowLastColumn="0" w:lastRowFirstColumn="0" w:lastRowLastColumn="0"/>
             </w:pPr>
+            <w:r>
+              <w:t>1</w:t>
+            </w:r>
           </w:p>
         </w:tc>
         <w:tc>
@@ -1728,6 +3793,13 @@
             <w:pPr>
               <w:cnfStyle w:val="000000010000" w:firstRow="0" w:lastRow="0" w:firstColumn="0" w:lastColumn="0" w:oddVBand="0" w:evenVBand="0" w:oddHBand="0" w:evenHBand="1" w:firstRowFirstColumn="0" w:firstRowLastColumn="0" w:lastRowFirstColumn="0" w:lastRowLastColumn="0"/>
             </w:pPr>
+            <w:r>
+              <w:rPr>
+                <w:rFonts w:ascii="Arial" w:hAnsi="Arial"/>
+                <w:sz w:val="21"/>
+              </w:rPr>
+              <w:t>25</w:t>
+            </w:r>
             <w:r>
               <w:rPr>
                 <w:rFonts w:ascii="Arial" w:hAnsi="Arial"/>
@@ -1765,6 +3837,9 @@
             <w:pPr>
               <w:cnfStyle w:val="000000100000" w:firstRow="0" w:lastRow="0" w:firstColumn="0" w:lastColumn="0" w:oddVBand="0" w:evenVBand="0" w:oddHBand="1" w:evenHBand="0" w:firstRowFirstColumn="0" w:firstRowLastColumn="0" w:lastRowFirstColumn="0" w:lastRowLastColumn="0"/>
             </w:pPr>
+            <w:r>
+              <w:t>0</w:t>
+            </w:r>
           </w:p>
         </w:tc>
         <w:tc>
@@ -1775,6 +3850,13 @@
             <w:pPr>
               <w:cnfStyle w:val="000000100000" w:firstRow="0" w:lastRow="0" w:firstColumn="0" w:lastColumn="0" w:oddVBand="0" w:evenVBand="0" w:oddHBand="1" w:evenHBand="0" w:firstRowFirstColumn="0" w:firstRowLastColumn="0" w:lastRowFirstColumn="0" w:lastRowLastColumn="0"/>
             </w:pPr>
+            <w:r>
+              <w:rPr>
+                <w:rFonts w:ascii="Arial" w:hAnsi="Arial"/>
+                <w:sz w:val="21"/>
+              </w:rPr>
+              <w:t>0</w:t>
+            </w:r>
             <w:r>
               <w:rPr>
                 <w:rFonts w:ascii="Arial" w:hAnsi="Arial"/>
@@ -1812,6 +3894,9 @@
             <w:pPr>
               <w:cnfStyle w:val="000000010000" w:firstRow="0" w:lastRow="0" w:firstColumn="0" w:lastColumn="0" w:oddVBand="0" w:evenVBand="0" w:oddHBand="0" w:evenHBand="1" w:firstRowFirstColumn="0" w:firstRowLastColumn="0" w:lastRowFirstColumn="0" w:lastRowLastColumn="0"/>
             </w:pPr>
+            <w:r>
+              <w:t>3</w:t>
+            </w:r>
           </w:p>
         </w:tc>
         <w:tc>
@@ -1822,6 +3907,13 @@
             <w:pPr>
               <w:cnfStyle w:val="000000010000" w:firstRow="0" w:lastRow="0" w:firstColumn="0" w:lastColumn="0" w:oddVBand="0" w:evenVBand="0" w:oddHBand="0" w:evenHBand="1" w:firstRowFirstColumn="0" w:firstRowLastColumn="0" w:lastRowFirstColumn="0" w:lastRowLastColumn="0"/>
             </w:pPr>
+            <w:r>
+              <w:rPr>
+                <w:rFonts w:ascii="Arial" w:hAnsi="Arial"/>
+                <w:sz w:val="21"/>
+              </w:rPr>
+              <w:t>75</w:t>
+            </w:r>
             <w:r>
               <w:rPr>
                 <w:rFonts w:ascii="Arial" w:hAnsi="Arial"/>
@@ -1847,58 +3939,40 @@
     <w:p>
       <w:r>
         <w:rPr>
-          <w:rFonts w:ascii="Arial" w:hAnsi="Arial"/>
+          <w:b/>
+          <w:bCs/>
         </w:rPr>
-        <w:t>Write 80–150 words describing patterns you observed. Where did AI shine? Where did AI fail? What is your recommendation for using AI in this kind of work in the future?</w:t>
+        <w:t>Conclusion:</w:t>
+      </w:r>
+      <w:r>
+        <w:t> Throughout this project, AI proved highly effective at accelerating repetitive tasks. It excelled at drafting standard test cases, generating structural templates (like Mermaid mindmaps), and quickly retrieving historical data on software vulnerabilities. However, clear failure patterns emerged when dealing with physical contexts. AI completely missed mechanical wear-and-tear edge cases (e.g., resonance vibrations or loose structural joints) and struggled to understand intermediate mechanical states. Furthermore, it occasionally hallucinated testing categorizations, such as misplacing Regression Testing.</w:t>
       </w:r>
     </w:p>
     <w:p>
+      <w:pPr>
+        <w:rPr>
+          <w:lang w:val="vi-VN"/>
+        </w:rPr>
+      </w:pPr>
       <w:r>
         <w:rPr>
-          <w:rFonts w:ascii="Arial" w:hAnsi="Arial"/>
+          <w:b/>
+          <w:bCs/>
         </w:rPr>
-        <w:t>__________________________________________________________________________________________</w:t>
+        <w:t>Recommendation:</w:t>
       </w:r>
-    </w:p>
-    <w:p>
+      <w:r>
+        <w:t> AI should be utilized as a "co-pilot" for brainstorming, generating boilerplate test suites, and structuring documentation. It should </w:t>
+      </w:r>
       <w:r>
         <w:rPr>
-          <w:rFonts w:ascii="Arial" w:hAnsi="Arial"/>
+          <w:b/>
+          <w:bCs/>
         </w:rPr>
-        <w:lastRenderedPageBreak/>
-        <w:t>__________________________________________________________________________________________</w:t>
+        <w:t>not</w:t>
       </w:r>
-    </w:p>
-    <w:p>
       <w:r>
-        <w:rPr>
-          <w:rFonts w:ascii="Arial" w:hAnsi="Arial"/>
-        </w:rPr>
-        <w:t>__________________________________________________________________________________________</w:t>
-      </w:r>
-    </w:p>
-    <w:p>
-      <w:r>
-        <w:rPr>
-          <w:rFonts w:ascii="Arial" w:hAnsi="Arial"/>
-        </w:rPr>
-        <w:t>__________________________________________________________________________________________</w:t>
-      </w:r>
-    </w:p>
-    <w:p>
-      <w:r>
-        <w:rPr>
-          <w:rFonts w:ascii="Arial" w:hAnsi="Arial"/>
-        </w:rPr>
-        <w:t>__________________________________________________________________________________________</w:t>
-      </w:r>
-    </w:p>
-    <w:p>
-      <w:r>
-        <w:rPr>
-          <w:rFonts w:ascii="Arial" w:hAnsi="Arial"/>
-        </w:rPr>
-        <w:t>__________________________________________________________________________________________</w:t>
+        <w:t> be trusted for physical/hardware edge-case testing, complex business logic validation, or final quality sign-off. Human QA engineers remain irreplaceable for verifying real-world physical behaviors and ensuring strict compliance with standards like ISTQB.</w:t>
       </w:r>
     </w:p>
     <w:p>
@@ -1914,14 +3988,21 @@
     </w:p>
     <w:p>
       <w:pPr>
-        <w:ind w:left="283"/>
+        <w:rPr>
+          <w:lang w:val="vi-VN"/>
+        </w:rPr>
       </w:pPr>
       <w:r>
+        <w:t xml:space="preserve">The standard test cases, software bugs dataset, and initial QA/QC mindmap were initially generated by Gemini and ChatGPT; I reviewed and modified the Mermaid mindmap and the bug classification analysis, added edge cases TC-009, TC-011, and TC-012; the test execution results, physical defect logs, AI critique, and self-assessment were written entirely by me. The detailed AI Audit Report is attached as Appendix B. I confirm I did not use AI to generate any artifact listed in the prohibited </w:t>
+      </w:r>
+      <w:r>
+        <w:t>category</w:t>
+      </w:r>
+      <w:r>
         <w:rPr>
-          <w:rFonts w:ascii="Arial" w:hAnsi="Arial"/>
-          <w:i/>
+          <w:lang w:val="vi-VN"/>
         </w:rPr>
-        <w:t>"[Test cases / script / dataset / report] was initially generated by [AI tool name]; I reviewed and modified [section X], added [edge cases Y, Z]; [section W] was written entirely by me. The detailed AI Audit Report is attached as Appendix A. I confirm I did not use AI to generate any artifact listed in the prohibited category."</w:t>
+        <w:t>.</w:t>
       </w:r>
     </w:p>
     <w:p>
@@ -1973,7 +4054,19 @@
           <w:p>
             <w:pPr>
               <w:cnfStyle w:val="100000000000" w:firstRow="1" w:lastRow="0" w:firstColumn="0" w:lastColumn="0" w:oddVBand="0" w:evenVBand="0" w:oddHBand="0" w:evenHBand="0" w:firstRowFirstColumn="0" w:firstRowLastColumn="0" w:lastRowFirstColumn="0" w:lastRowLastColumn="0"/>
+              <w:rPr>
+                <w:lang w:val="vi-VN"/>
+              </w:rPr>
             </w:pPr>
+            <w:r>
+              <w:t>Tran</w:t>
+            </w:r>
+            <w:r>
+              <w:rPr>
+                <w:lang w:val="vi-VN"/>
+              </w:rPr>
+              <w:t xml:space="preserve"> Dai Hiep</w:t>
+            </w:r>
           </w:p>
         </w:tc>
       </w:tr>
@@ -2005,6 +4098,9 @@
             <w:pPr>
               <w:cnfStyle w:val="000000100000" w:firstRow="0" w:lastRow="0" w:firstColumn="0" w:lastColumn="0" w:oddVBand="0" w:evenVBand="0" w:oddHBand="1" w:evenHBand="0" w:firstRowFirstColumn="0" w:firstRowLastColumn="0" w:lastRowFirstColumn="0" w:lastRowLastColumn="0"/>
             </w:pPr>
+            <w:r>
+              <w:t>23120256</w:t>
+            </w:r>
           </w:p>
         </w:tc>
       </w:tr>
@@ -2149,7 +4245,19 @@
           <w:p>
             <w:pPr>
               <w:cnfStyle w:val="000000100000" w:firstRow="0" w:lastRow="0" w:firstColumn="0" w:lastColumn="0" w:oddVBand="0" w:evenVBand="0" w:oddHBand="1" w:evenHBand="0" w:firstRowFirstColumn="0" w:firstRowLastColumn="0" w:lastRowFirstColumn="0" w:lastRowLastColumn="0"/>
+              <w:rPr>
+                <w:lang w:val="vi-VN"/>
+              </w:rPr>
             </w:pPr>
+            <w:r>
+              <w:t>27</w:t>
+            </w:r>
+            <w:r>
+              <w:rPr>
+                <w:lang w:val="vi-VN"/>
+              </w:rPr>
+              <w:t>/09/2026</w:t>
+            </w:r>
           </w:p>
         </w:tc>
       </w:tr>
@@ -2181,6 +4289,46 @@
             <w:pPr>
               <w:cnfStyle w:val="000000010000" w:firstRow="0" w:lastRow="0" w:firstColumn="0" w:lastColumn="0" w:oddVBand="0" w:evenVBand="0" w:oddHBand="0" w:evenHBand="1" w:firstRowFirstColumn="0" w:firstRowLastColumn="0" w:lastRowFirstColumn="0" w:lastRowLastColumn="0"/>
             </w:pPr>
+            <w:r>
+              <w:rPr>
+                <w:noProof/>
+              </w:rPr>
+              <w:drawing>
+                <wp:inline distT="0" distB="0" distL="0" distR="0" wp14:anchorId="1E89BF54" wp14:editId="7EE9E3C7">
+                  <wp:extent cx="641350" cy="417074"/>
+                  <wp:effectExtent l="0" t="0" r="6350" b="2540"/>
+                  <wp:docPr id="241316673" name="Picture 1"/>
+                  <wp:cNvGraphicFramePr>
+                    <a:graphicFrameLocks xmlns:a="http://schemas.openxmlformats.org/drawingml/2006/main" noChangeAspect="1"/>
+                  </wp:cNvGraphicFramePr>
+                  <a:graphic xmlns:a="http://schemas.openxmlformats.org/drawingml/2006/main">
+                    <a:graphicData uri="http://schemas.openxmlformats.org/drawingml/2006/picture">
+                      <pic:pic xmlns:pic="http://schemas.openxmlformats.org/drawingml/2006/picture">
+                        <pic:nvPicPr>
+                          <pic:cNvPr id="241316673" name="Picture 241316673"/>
+                          <pic:cNvPicPr/>
+                        </pic:nvPicPr>
+                        <pic:blipFill>
+                          <a:blip r:embed="rId8"/>
+                          <a:stretch>
+                            <a:fillRect/>
+                          </a:stretch>
+                        </pic:blipFill>
+                        <pic:spPr>
+                          <a:xfrm>
+                            <a:off x="0" y="0"/>
+                            <a:ext cx="651901" cy="423935"/>
+                          </a:xfrm>
+                          <a:prstGeom prst="rect">
+                            <a:avLst/>
+                          </a:prstGeom>
+                        </pic:spPr>
+                      </pic:pic>
+                    </a:graphicData>
+                  </a:graphic>
+                </wp:inline>
+              </w:drawing>
+            </w:r>
           </w:p>
         </w:tc>
       </w:tr>
@@ -2259,6 +4407,7 @@
         <w:rPr>
           <w:rFonts w:ascii="Arial" w:hAnsi="Arial"/>
         </w:rPr>
+        <w:lastRenderedPageBreak/>
         <w:t>Anthropic (2025). Building reliable AI test agents — engineering blog.</w:t>
       </w:r>
     </w:p>
@@ -2438,7 +4587,7 @@
   <w:abstractNum w:abstractNumId="8" w15:restartNumberingAfterBreak="0">
     <w:nsid w:val="FFFFFF89"/>
     <w:multiLevelType w:val="singleLevel"/>
-    <w:tmpl w:val="29761A62"/>
+    <w:tmpl w:val="348EADC8"/>
     <w:lvl w:ilvl="0">
       <w:start w:val="1"/>
       <w:numFmt w:val="bullet"/>
@@ -3089,7 +5238,6 @@
   <w:style w:type="character" w:default="1" w:styleId="DefaultParagraphFont">
     <w:name w:val="Default Paragraph Font"/>
     <w:uiPriority w:val="1"/>
-    <w:semiHidden/>
     <w:unhideWhenUsed/>
   </w:style>
   <w:style w:type="table" w:default="1" w:styleId="TableNormal">
@@ -13865,6 +16013,29 @@
         <w:shd w:val="clear" w:color="auto" w:fill="FBCAA2" w:themeFill="accent6" w:themeFillTint="7F"/>
       </w:tcPr>
     </w:tblStylePr>
+  </w:style>
+  <w:style w:type="character" w:styleId="Hyperlink">
+    <w:name w:val="Hyperlink"/>
+    <w:basedOn w:val="DefaultParagraphFont"/>
+    <w:uiPriority w:val="99"/>
+    <w:unhideWhenUsed/>
+    <w:rsid w:val="00547A8B"/>
+    <w:rPr>
+      <w:color w:val="0000FF" w:themeColor="hyperlink"/>
+      <w:u w:val="single"/>
+    </w:rPr>
+  </w:style>
+  <w:style w:type="character" w:styleId="UnresolvedMention">
+    <w:name w:val="Unresolved Mention"/>
+    <w:basedOn w:val="DefaultParagraphFont"/>
+    <w:uiPriority w:val="99"/>
+    <w:semiHidden/>
+    <w:unhideWhenUsed/>
+    <w:rsid w:val="00547A8B"/>
+    <w:rPr>
+      <w:color w:val="605E5C"/>
+      <w:shd w:val="clear" w:color="auto" w:fill="E1DFDD"/>
+    </w:rPr>
   </w:style>
 </w:styles>
 </file>

</xml_diff>